<commit_message>
Actualiza evidencias grupales Fase 1 solo backend y README
</commit_message>
<xml_diff>
--- a/Fase1/Evidencias_grupales/1.4_APT122_FormativaFase1.docx
+++ b/Fase1/Evidencias_grupales/1.4_APT122_FormativaFase1.docx
@@ -51,8 +51,14 @@
     <w:p>
       <w:pPr>
         <w:pStyle w:val="Ttulo"/>
-      </w:pPr>
-      <w:r>
+        <w:rPr>
+          <w:lang w:val="es-CL"/>
+        </w:rPr>
+      </w:pPr>
+      <w:r>
+        <w:rPr>
+          <w:lang w:val="es-CL"/>
+        </w:rPr>
         <w:t>Informe Sumativo de Definición del Proyecto APT</w:t>
       </w:r>
     </w:p>
@@ -60,8 +66,13 @@
       <w:pPr>
         <w:pStyle w:val="Subttulo"/>
       </w:pPr>
-      <w:r>
-        <w:t>Aprueba Administración · Fase 1</w:t>
+      <w:proofErr w:type="spellStart"/>
+      <w:r>
+        <w:t>Aprueba</w:t>
+      </w:r>
+      <w:proofErr w:type="spellEnd"/>
+      <w:r>
+        <w:t xml:space="preserve"> Administración · Fase 1</w:t>
       </w:r>
     </w:p>
     <w:tbl>
@@ -119,12 +130,21 @@
             <w:pPr>
               <w:spacing w:after="20" w:line="240" w:lineRule="auto"/>
             </w:pPr>
+            <w:proofErr w:type="spellStart"/>
             <w:r>
               <w:rPr>
                 <w:sz w:val="18"/>
                 <w:szCs w:val="18"/>
               </w:rPr>
-              <w:t>Aprueba Administración</w:t>
+              <w:t>Aprueba</w:t>
+            </w:r>
+            <w:proofErr w:type="spellEnd"/>
+            <w:r>
+              <w:rPr>
+                <w:sz w:val="18"/>
+                <w:szCs w:val="18"/>
+              </w:rPr>
+              <w:t xml:space="preserve"> Administración</w:t>
             </w:r>
           </w:p>
         </w:tc>
@@ -147,6 +167,7 @@
             <w:pPr>
               <w:spacing w:after="20" w:line="240" w:lineRule="auto"/>
             </w:pPr>
+            <w:proofErr w:type="spellStart"/>
             <w:r>
               <w:rPr>
                 <w:b/>
@@ -157,6 +178,7 @@
               </w:rPr>
               <w:t>Asignatura</w:t>
             </w:r>
+            <w:proofErr w:type="spellEnd"/>
           </w:p>
         </w:tc>
         <w:tc>
@@ -224,11 +246,15 @@
           <w:p>
             <w:pPr>
               <w:spacing w:after="20" w:line="240" w:lineRule="auto"/>
+              <w:rPr>
+                <w:lang w:val="es-CL"/>
+              </w:rPr>
             </w:pPr>
             <w:r>
               <w:rPr>
                 <w:sz w:val="18"/>
                 <w:szCs w:val="18"/>
+                <w:lang w:val="es-CL"/>
               </w:rPr>
               <w:t>Tsung-Hao Liu · Catalina Yanara Padilla Astudillo · Felipe Antonio Rojas Riffo</w:t>
             </w:r>
@@ -325,8 +351,20 @@
                 <w:sz w:val="18"/>
                 <w:szCs w:val="18"/>
               </w:rPr>
-              <w:t>Carrera / sede</w:t>
+              <w:t xml:space="preserve">Carrera / </w:t>
             </w:r>
+            <w:proofErr w:type="spellStart"/>
+            <w:r>
+              <w:rPr>
+                <w:b/>
+                <w:bCs/>
+                <w:color w:val="1A365D"/>
+                <w:sz w:val="18"/>
+                <w:szCs w:val="18"/>
+              </w:rPr>
+              <w:t>sede</w:t>
+            </w:r>
+            <w:proofErr w:type="spellEnd"/>
           </w:p>
         </w:tc>
         <w:tc>
@@ -341,11 +379,15 @@
           <w:p>
             <w:pPr>
               <w:spacing w:after="20" w:line="240" w:lineRule="auto"/>
+              <w:rPr>
+                <w:lang w:val="es-CL"/>
+              </w:rPr>
             </w:pPr>
             <w:r>
               <w:rPr>
                 <w:sz w:val="18"/>
                 <w:szCs w:val="18"/>
+                <w:lang w:val="es-CL"/>
               </w:rPr>
               <w:t xml:space="preserve">Ingeniería en Informática · Plaza Oeste </w:t>
             </w:r>
@@ -353,14 +395,22 @@
         </w:tc>
       </w:tr>
     </w:tbl>
-    <w:p/>
     <w:p>
       <w:pPr>
+        <w:rPr>
+          <w:lang w:val="es-CL"/>
+        </w:rPr>
+      </w:pPr>
+    </w:p>
+    <w:p>
+      <w:pPr>
         <w:pStyle w:val="Ttulo1"/>
       </w:pPr>
+      <w:proofErr w:type="spellStart"/>
       <w:r>
         <w:t>Índice</w:t>
       </w:r>
+      <w:proofErr w:type="spellEnd"/>
     </w:p>
     <w:p>
       <w:pPr>
@@ -377,435 +427,74 @@
         </w:rPr>
       </w:pPr>
     </w:p>
-    <w:tbl>
-      <w:tblPr>
-        <w:tblW w:w="0" w:type="auto"/>
-        <w:tblBorders>
-          <w:top w:val="single" w:sz="4" w:space="0" w:color="auto"/>
-          <w:left w:val="single" w:sz="4" w:space="0" w:color="auto"/>
-          <w:bottom w:val="single" w:sz="4" w:space="0" w:color="auto"/>
-          <w:right w:val="single" w:sz="4" w:space="0" w:color="auto"/>
-          <w:insideH w:val="single" w:sz="4" w:space="0" w:color="auto"/>
-          <w:insideV w:val="single" w:sz="4" w:space="0" w:color="auto"/>
-        </w:tblBorders>
-        <w:tblLayout w:type="fixed"/>
-        <w:tblCellMar>
-          <w:left w:w="70" w:type="dxa"/>
-          <w:right w:w="70" w:type="dxa"/>
-        </w:tblCellMar>
-        <w:tblLook w:val="0000" w:firstRow="0" w:lastRow="0" w:firstColumn="0" w:lastColumn="0" w:noHBand="0" w:noVBand="0"/>
-      </w:tblPr>
-      <w:tblGrid>
-        <w:gridCol w:w="4882"/>
-        <w:gridCol w:w="4882"/>
-      </w:tblGrid>
-      <w:tr>
-        <w:tblPrEx>
-          <w:tblCellMar>
-            <w:top w:w="0" w:type="dxa"/>
-            <w:bottom w:w="0" w:type="dxa"/>
-          </w:tblCellMar>
-        </w:tblPrEx>
-        <w:tc>
-          <w:tcPr>
-            <w:tcW w:w="4882" w:type="dxa"/>
-          </w:tcPr>
-          <w:p>
-            <w:pPr>
-              <w:spacing w:after="0"/>
-              <w:rPr>
-                <w:rFonts w:ascii="Aptos" w:hAnsi="Aptos"/>
-                <w:sz w:val="16"/>
-              </w:rPr>
-            </w:pPr>
-            <w:r>
-              <w:rPr>
-                <w:rFonts w:ascii="Aptos" w:hAnsi="Aptos"/>
-                <w:sz w:val="16"/>
-              </w:rPr>
-              <w:t>Resumen ejecutivo</w:t>
-            </w:r>
-          </w:p>
-        </w:tc>
-        <w:tc>
-          <w:tcPr>
-            <w:tcW w:w="4882" w:type="dxa"/>
-          </w:tcPr>
-          <w:p>
-            <w:pPr>
-              <w:spacing w:after="0"/>
-              <w:rPr>
-                <w:rFonts w:ascii="Aptos" w:hAnsi="Aptos"/>
-                <w:sz w:val="16"/>
-              </w:rPr>
-            </w:pPr>
-            <w:r>
-              <w:rPr>
-                <w:rFonts w:ascii="Aptos" w:hAnsi="Aptos"/>
-                <w:sz w:val="16"/>
-              </w:rPr>
-              <w:t>Abstract</w:t>
-            </w:r>
-          </w:p>
-        </w:tc>
-      </w:tr>
-      <w:tr>
-        <w:tblPrEx>
-          <w:tblCellMar>
-            <w:top w:w="0" w:type="dxa"/>
-            <w:bottom w:w="0" w:type="dxa"/>
-          </w:tblCellMar>
-        </w:tblPrEx>
-        <w:tc>
-          <w:tcPr>
-            <w:tcW w:w="4882" w:type="dxa"/>
-          </w:tcPr>
-          <w:p>
-            <w:pPr>
-              <w:spacing w:after="0"/>
-              <w:rPr>
-                <w:rFonts w:ascii="Aptos" w:hAnsi="Aptos"/>
-                <w:sz w:val="16"/>
-              </w:rPr>
-            </w:pPr>
-            <w:r>
-              <w:rPr>
-                <w:rFonts w:ascii="Aptos" w:hAnsi="Aptos"/>
-                <w:sz w:val="16"/>
-              </w:rPr>
-              <w:t>1. Contexto y problema</w:t>
-            </w:r>
-          </w:p>
-        </w:tc>
-        <w:tc>
-          <w:tcPr>
-            <w:tcW w:w="4882" w:type="dxa"/>
-          </w:tcPr>
-          <w:p>
-            <w:pPr>
-              <w:spacing w:after="0"/>
-              <w:rPr>
-                <w:rFonts w:ascii="Aptos" w:hAnsi="Aptos"/>
-                <w:sz w:val="16"/>
-              </w:rPr>
-            </w:pPr>
-            <w:r>
-              <w:rPr>
-                <w:rFonts w:ascii="Aptos" w:hAnsi="Aptos"/>
-                <w:sz w:val="16"/>
-              </w:rPr>
-              <w:t>2. Alcance del proyecto</w:t>
-            </w:r>
-          </w:p>
-        </w:tc>
-      </w:tr>
-      <w:tr>
-        <w:tblPrEx>
-          <w:tblCellMar>
-            <w:top w:w="0" w:type="dxa"/>
-            <w:bottom w:w="0" w:type="dxa"/>
-          </w:tblCellMar>
-        </w:tblPrEx>
-        <w:tc>
-          <w:tcPr>
-            <w:tcW w:w="4882" w:type="dxa"/>
-          </w:tcPr>
-          <w:p>
-            <w:pPr>
-              <w:spacing w:after="0"/>
-              <w:rPr>
-                <w:rFonts w:ascii="Aptos" w:hAnsi="Aptos"/>
-                <w:sz w:val="16"/>
-              </w:rPr>
-            </w:pPr>
-            <w:r>
-              <w:rPr>
-                <w:rFonts w:ascii="Aptos" w:hAnsi="Aptos"/>
-                <w:sz w:val="16"/>
-              </w:rPr>
-              <w:t>3. Objetivos</w:t>
-            </w:r>
-          </w:p>
-        </w:tc>
-        <w:tc>
-          <w:tcPr>
-            <w:tcW w:w="4882" w:type="dxa"/>
-          </w:tcPr>
-          <w:p>
-            <w:pPr>
-              <w:spacing w:after="0"/>
-              <w:rPr>
-                <w:rFonts w:ascii="Aptos" w:hAnsi="Aptos"/>
-                <w:sz w:val="16"/>
-              </w:rPr>
-            </w:pPr>
-            <w:r>
-              <w:rPr>
-                <w:rFonts w:ascii="Aptos" w:hAnsi="Aptos"/>
-                <w:sz w:val="16"/>
-              </w:rPr>
-              <w:t>4. Pertinencia con el perfil de egreso</w:t>
-            </w:r>
-          </w:p>
-        </w:tc>
-      </w:tr>
-      <w:tr>
-        <w:tblPrEx>
-          <w:tblCellMar>
-            <w:top w:w="0" w:type="dxa"/>
-            <w:bottom w:w="0" w:type="dxa"/>
-          </w:tblCellMar>
-        </w:tblPrEx>
-        <w:tc>
-          <w:tcPr>
-            <w:tcW w:w="4882" w:type="dxa"/>
-          </w:tcPr>
-          <w:p>
-            <w:pPr>
-              <w:spacing w:after="0"/>
-              <w:rPr>
-                <w:rFonts w:ascii="Aptos" w:hAnsi="Aptos"/>
-                <w:sz w:val="16"/>
-              </w:rPr>
-            </w:pPr>
-            <w:r>
-              <w:rPr>
-                <w:rFonts w:ascii="Aptos" w:hAnsi="Aptos"/>
-                <w:sz w:val="16"/>
-              </w:rPr>
-              <w:t>5. Intereses profesionales</w:t>
-            </w:r>
-          </w:p>
-        </w:tc>
-        <w:tc>
-          <w:tcPr>
-            <w:tcW w:w="4882" w:type="dxa"/>
-          </w:tcPr>
-          <w:p>
-            <w:pPr>
-              <w:spacing w:after="0"/>
-              <w:rPr>
-                <w:rFonts w:ascii="Aptos" w:hAnsi="Aptos"/>
-                <w:sz w:val="16"/>
-              </w:rPr>
-            </w:pPr>
-            <w:r>
-              <w:rPr>
-                <w:rFonts w:ascii="Aptos" w:hAnsi="Aptos"/>
-                <w:sz w:val="16"/>
-              </w:rPr>
-              <w:t>6. Factibilidad</w:t>
-            </w:r>
-          </w:p>
-        </w:tc>
-      </w:tr>
-      <w:tr>
-        <w:tblPrEx>
-          <w:tblCellMar>
-            <w:top w:w="0" w:type="dxa"/>
-            <w:bottom w:w="0" w:type="dxa"/>
-          </w:tblCellMar>
-        </w:tblPrEx>
-        <w:tc>
-          <w:tcPr>
-            <w:tcW w:w="4882" w:type="dxa"/>
-          </w:tcPr>
-          <w:p>
-            <w:pPr>
-              <w:spacing w:after="0"/>
-              <w:rPr>
-                <w:rFonts w:ascii="Aptos" w:hAnsi="Aptos"/>
-                <w:sz w:val="16"/>
-              </w:rPr>
-            </w:pPr>
-            <w:r>
-              <w:rPr>
-                <w:rFonts w:ascii="Aptos" w:hAnsi="Aptos"/>
-                <w:sz w:val="16"/>
-              </w:rPr>
-              <w:t>7. Metodología</w:t>
-            </w:r>
-          </w:p>
-        </w:tc>
-        <w:tc>
-          <w:tcPr>
-            <w:tcW w:w="4882" w:type="dxa"/>
-          </w:tcPr>
-          <w:p>
-            <w:pPr>
-              <w:spacing w:after="0"/>
-              <w:rPr>
-                <w:rFonts w:ascii="Aptos" w:hAnsi="Aptos"/>
-                <w:sz w:val="16"/>
-              </w:rPr>
-            </w:pPr>
-            <w:r>
-              <w:rPr>
-                <w:rFonts w:ascii="Aptos" w:hAnsi="Aptos"/>
-                <w:sz w:val="16"/>
-              </w:rPr>
-              <w:t>8. Arquitectura y evidencia técnica</w:t>
-            </w:r>
-          </w:p>
-        </w:tc>
-      </w:tr>
-      <w:tr>
-        <w:tblPrEx>
-          <w:tblCellMar>
-            <w:top w:w="0" w:type="dxa"/>
-            <w:bottom w:w="0" w:type="dxa"/>
-          </w:tblCellMar>
-        </w:tblPrEx>
-        <w:tc>
-          <w:tcPr>
-            <w:tcW w:w="4882" w:type="dxa"/>
-          </w:tcPr>
-          <w:p>
-            <w:pPr>
-              <w:spacing w:after="0"/>
-              <w:rPr>
-                <w:rFonts w:ascii="Aptos" w:hAnsi="Aptos"/>
-                <w:sz w:val="16"/>
-              </w:rPr>
-            </w:pPr>
-            <w:r>
-              <w:rPr>
-                <w:rFonts w:ascii="Aptos" w:hAnsi="Aptos"/>
-                <w:sz w:val="16"/>
-              </w:rPr>
-              <w:t>9. Evidencias propuestas</w:t>
-            </w:r>
-          </w:p>
-        </w:tc>
-        <w:tc>
-          <w:tcPr>
-            <w:tcW w:w="4882" w:type="dxa"/>
-          </w:tcPr>
-          <w:p>
-            <w:pPr>
-              <w:spacing w:after="0"/>
-              <w:rPr>
-                <w:rFonts w:ascii="Aptos" w:hAnsi="Aptos"/>
-                <w:sz w:val="16"/>
-              </w:rPr>
-            </w:pPr>
-            <w:r>
-              <w:rPr>
-                <w:rFonts w:ascii="Aptos" w:hAnsi="Aptos"/>
-                <w:sz w:val="16"/>
-              </w:rPr>
-              <w:t>10. Propiedad intelectual y uso de IA</w:t>
-            </w:r>
-          </w:p>
-        </w:tc>
-      </w:tr>
-      <w:tr>
-        <w:tblPrEx>
-          <w:tblCellMar>
-            <w:top w:w="0" w:type="dxa"/>
-            <w:bottom w:w="0" w:type="dxa"/>
-          </w:tblCellMar>
-        </w:tblPrEx>
-        <w:tc>
-          <w:tcPr>
-            <w:tcW w:w="4882" w:type="dxa"/>
-          </w:tcPr>
-          <w:p>
-            <w:pPr>
-              <w:spacing w:after="0"/>
-              <w:rPr>
-                <w:rFonts w:ascii="Aptos" w:hAnsi="Aptos"/>
-                <w:sz w:val="16"/>
-              </w:rPr>
-            </w:pPr>
-            <w:r>
-              <w:rPr>
-                <w:rFonts w:ascii="Aptos" w:hAnsi="Aptos"/>
-                <w:sz w:val="16"/>
-              </w:rPr>
-              <w:t>11. Conclusión grupal</w:t>
-            </w:r>
-          </w:p>
-        </w:tc>
-        <w:tc>
-          <w:tcPr>
-            <w:tcW w:w="4882" w:type="dxa"/>
-          </w:tcPr>
-          <w:p>
-            <w:pPr>
-              <w:spacing w:after="0"/>
-              <w:rPr>
-                <w:rFonts w:ascii="Aptos" w:hAnsi="Aptos"/>
-                <w:sz w:val="16"/>
-              </w:rPr>
-            </w:pPr>
-            <w:r>
-              <w:rPr>
-                <w:rFonts w:ascii="Aptos" w:hAnsi="Aptos"/>
-                <w:sz w:val="16"/>
-              </w:rPr>
-              <w:t>12. Conclusiones individuales</w:t>
-            </w:r>
-          </w:p>
-        </w:tc>
-      </w:tr>
-      <w:tr>
-        <w:tblPrEx>
-          <w:tblCellMar>
-            <w:top w:w="0" w:type="dxa"/>
-            <w:bottom w:w="0" w:type="dxa"/>
-          </w:tblCellMar>
-        </w:tblPrEx>
-        <w:tc>
-          <w:tcPr>
-            <w:tcW w:w="4882" w:type="dxa"/>
-          </w:tcPr>
-          <w:p>
-            <w:pPr>
-              <w:spacing w:after="0"/>
-              <w:rPr>
-                <w:rFonts w:ascii="Aptos" w:hAnsi="Aptos"/>
-                <w:sz w:val="16"/>
-              </w:rPr>
-            </w:pPr>
-            <w:r>
-              <w:rPr>
-                <w:rFonts w:ascii="Aptos" w:hAnsi="Aptos"/>
-                <w:sz w:val="16"/>
-              </w:rPr>
-              <w:t>Referencias</w:t>
-            </w:r>
-          </w:p>
-        </w:tc>
-        <w:tc>
-          <w:tcPr>
-            <w:tcW w:w="4882" w:type="dxa"/>
-          </w:tcPr>
-          <w:p>
-            <w:pPr>
-              <w:spacing w:after="0"/>
-              <w:rPr>
-                <w:rFonts w:ascii="Aptos" w:hAnsi="Aptos"/>
-                <w:sz w:val="16"/>
-              </w:rPr>
-            </w:pPr>
-          </w:p>
-        </w:tc>
-      </w:tr>
-    </w:tbl>
-    <w:p/>
     <w:p/>
     <w:p>
       <w:pPr>
         <w:pStyle w:val="Ttulo1"/>
       </w:pPr>
-      <w:r>
-        <w:t>Resumen ejecutivo</w:t>
-      </w:r>
+      <w:proofErr w:type="spellStart"/>
+      <w:r>
+        <w:t>Resumen</w:t>
+      </w:r>
+      <w:proofErr w:type="spellEnd"/>
+      <w:r>
+        <w:t xml:space="preserve"> </w:t>
+      </w:r>
+      <w:proofErr w:type="spellStart"/>
+      <w:r>
+        <w:t>ejecutivo</w:t>
+      </w:r>
+      <w:proofErr w:type="spellEnd"/>
     </w:p>
     <w:p>
-      <w:r>
-        <w:t>Aprueba Administración es la consola web administrativa de la plataforma freemium Aprueba. Centraliza indicadores de negocio, gestión de sponsors, operación técnica, usuarios y soporte, tutores, contenido y planes. Su propósito es entregar trazabilidad y control a gerencia, finanzas, operaciones y soporte mediante una SPA React y una API Express conectada a Firestore.</w:t>
+      <w:pPr>
+        <w:rPr>
+          <w:lang w:val="es-CL"/>
+        </w:rPr>
+      </w:pPr>
+      <w:r>
+        <w:rPr>
+          <w:rFonts w:ascii="Arial" w:hAnsi="Arial"/>
+          <w:sz w:val="21"/>
+          <w:lang w:val="es-CL"/>
+        </w:rPr>
+        <w:t xml:space="preserve">Aprueba Administración corresponde al </w:t>
+      </w:r>
+      <w:proofErr w:type="spellStart"/>
+      <w:r>
+        <w:rPr>
+          <w:rFonts w:ascii="Arial" w:hAnsi="Arial"/>
+          <w:sz w:val="21"/>
+          <w:lang w:val="es-CL"/>
+        </w:rPr>
+        <w:t>backend</w:t>
+      </w:r>
+      <w:proofErr w:type="spellEnd"/>
+      <w:r>
+        <w:rPr>
+          <w:rFonts w:ascii="Arial" w:hAnsi="Arial"/>
+          <w:sz w:val="21"/>
+          <w:lang w:val="es-CL"/>
+        </w:rPr>
+        <w:t xml:space="preserve"> de la consola administrativa de la plataforma Aprueba. El proyecto implementará los 27 </w:t>
+      </w:r>
+      <w:proofErr w:type="spellStart"/>
+      <w:r>
+        <w:rPr>
+          <w:rFonts w:ascii="Arial" w:hAnsi="Arial"/>
+          <w:sz w:val="21"/>
+          <w:lang w:val="es-CL"/>
+        </w:rPr>
+        <w:t>endpoints</w:t>
+      </w:r>
+      <w:proofErr w:type="spellEnd"/>
+      <w:r>
+        <w:rPr>
+          <w:rFonts w:ascii="Arial" w:hAnsi="Arial"/>
+          <w:sz w:val="21"/>
+          <w:lang w:val="es-CL"/>
+        </w:rPr>
+        <w:t xml:space="preserve"> definidos en el contrato API para autenticación administrativa, métricas, patrocinadores, plataformas, servicios, contenedores, usuarios, tickets, correcciones, preguntas, funcionalidades y planes. La Fase 1 establece el alcance, los requisitos, la arquitectura lógica, el plan de trabajo y las evidencias. La base de datos, el repositorio vigente, los servicios externos y el proveedor de despliegue se encuentran pendientes de entrega o confirmación.</w:t>
       </w:r>
     </w:p>
     <w:p>
@@ -817,47 +506,161 @@
       </w:r>
     </w:p>
     <w:p>
-      <w:r>
-        <w:t xml:space="preserve">Aprueba Administración is a full-stack web console designed to centralize business and operational management for the Aprueba exam-practice platform. The project covers eight administrative views, role-based access, a versioned API, Firestore persistence, security, accessibility, testing and agile delivery. During </w:t>
-      </w:r>
-      <w:r>
-        <w:lastRenderedPageBreak/>
-        <w:t>Phase 1, the team defines scope, requirements, architecture, evidence and an 18-week roadmap. Existing source code is treated as verifiable input: the frontend build and backend syntax were checked, while automated tests, Docker, CI/CD and production deployment remain planned work.</w:t>
+      <w:proofErr w:type="spellStart"/>
+      <w:r>
+        <w:rPr>
+          <w:rFonts w:ascii="Arial" w:hAnsi="Arial"/>
+          <w:sz w:val="21"/>
+        </w:rPr>
+        <w:t>Aprueba</w:t>
+      </w:r>
+      <w:proofErr w:type="spellEnd"/>
+      <w:r>
+        <w:rPr>
+          <w:rFonts w:ascii="Arial" w:hAnsi="Arial"/>
+          <w:sz w:val="21"/>
+        </w:rPr>
+        <w:t xml:space="preserve"> Administración is a backend project for the administrative console of the </w:t>
+      </w:r>
+      <w:proofErr w:type="spellStart"/>
+      <w:r>
+        <w:rPr>
+          <w:rFonts w:ascii="Arial" w:hAnsi="Arial"/>
+          <w:sz w:val="21"/>
+        </w:rPr>
+        <w:t>Aprueba</w:t>
+      </w:r>
+      <w:proofErr w:type="spellEnd"/>
+      <w:r>
+        <w:rPr>
+          <w:rFonts w:ascii="Arial" w:hAnsi="Arial"/>
+          <w:sz w:val="21"/>
+        </w:rPr>
+        <w:t xml:space="preserve"> platform. Its functional scope consists of the 27 administrative endpoints defined in the API contract, including authentication, metrics, sponsors, operational monitoring, user support, questions, features, and plans. During Phase 1, the team defines the requirements, provider-neutral architecture, test strategy, responsibilities, risks, and an eighteen-week agile plan. The current source code, database credentials, external services, and deployment provider have not yet been supplied as current technical evidence. Therefore, implementation, automated test, and production deployment results remain planned and will be verified after the corresponding inputs are received.</w:t>
       </w:r>
     </w:p>
     <w:p>
       <w:pPr>
         <w:pStyle w:val="Ttulo1"/>
-      </w:pPr>
-      <w:r>
+        <w:rPr>
+          <w:lang w:val="es-CL"/>
+        </w:rPr>
+      </w:pPr>
+      <w:r>
+        <w:rPr>
+          <w:lang w:val="es-CL"/>
+        </w:rPr>
+        <w:lastRenderedPageBreak/>
         <w:t>1. Contexto y problema</w:t>
       </w:r>
     </w:p>
     <w:p>
-      <w:r>
-        <w:t>La plataforma Aprueba requiere un punto único y controlado para supervisar adopción, conversión, recaudación y salud operativa, y para ejecutar acciones administrativas con permisos diferenciados. Sin una consola central, la información y las operaciones quedan fragmentadas, aumentan los tiempos de respuesta y disminuye la trazabilidad de acciones sensibles.</w:t>
+      <w:pPr>
+        <w:rPr>
+          <w:lang w:val="es-CL"/>
+        </w:rPr>
+      </w:pPr>
+      <w:r>
+        <w:rPr>
+          <w:rFonts w:ascii="Arial" w:hAnsi="Arial"/>
+          <w:sz w:val="21"/>
+          <w:lang w:val="es-CL"/>
+        </w:rPr>
+        <w:t xml:space="preserve">La administración de Aprueba necesita servicios de </w:t>
+      </w:r>
+      <w:proofErr w:type="spellStart"/>
+      <w:r>
+        <w:rPr>
+          <w:rFonts w:ascii="Arial" w:hAnsi="Arial"/>
+          <w:sz w:val="21"/>
+          <w:lang w:val="es-CL"/>
+        </w:rPr>
+        <w:t>backend</w:t>
+      </w:r>
+      <w:proofErr w:type="spellEnd"/>
+      <w:r>
+        <w:rPr>
+          <w:rFonts w:ascii="Arial" w:hAnsi="Arial"/>
+          <w:sz w:val="21"/>
+          <w:lang w:val="es-CL"/>
+        </w:rPr>
+        <w:t xml:space="preserve"> que concentren consultas operativas y comerciales, apliquen permisos por rol y registren acciones sensibles. Sin un contrato implementado y verificable, los responsables de administración, finanzas, operaciones y soporte no disponen de una forma uniforme de consultar datos o ejecutar operaciones. El proyecto aborda esta necesidad mediante una API administrativa trazable y comprobable.</w:t>
       </w:r>
     </w:p>
     <w:p>
       <w:pPr>
         <w:pStyle w:val="Ttulo1"/>
-      </w:pPr>
-      <w:r>
+        <w:rPr>
+          <w:lang w:val="es-CL"/>
+        </w:rPr>
+      </w:pPr>
+      <w:r>
+        <w:rPr>
+          <w:lang w:val="es-CL"/>
+        </w:rPr>
         <w:t>2. Alcance del proyecto</w:t>
       </w:r>
     </w:p>
     <w:p>
-      <w:r>
-        <w:t>El MVP comprende las vistas Resumen, Comercial, Sponsors, Operativa, Usuarios y soporte, Tutores, Contenido y Planes y productos; autenticación JWT con flujo MFA demostrativo; roles admin, finance, ops y support; API REST /api/v1/admin; persistencia Firestore; i18n español/inglés y tema claro/oscuro.</w:t>
+      <w:pPr>
+        <w:rPr>
+          <w:lang w:val="es-CL"/>
+        </w:rPr>
+      </w:pPr>
+      <w:r>
+        <w:rPr>
+          <w:rFonts w:ascii="Arial" w:hAnsi="Arial"/>
+          <w:sz w:val="21"/>
+          <w:lang w:val="es-CL"/>
+        </w:rPr>
+        <w:t xml:space="preserve">El alcance funcional incluye exclusivamente los 27 </w:t>
+      </w:r>
+      <w:proofErr w:type="spellStart"/>
+      <w:r>
+        <w:rPr>
+          <w:rFonts w:ascii="Arial" w:hAnsi="Arial"/>
+          <w:sz w:val="21"/>
+          <w:lang w:val="es-CL"/>
+        </w:rPr>
+        <w:t>endpoints</w:t>
+      </w:r>
+      <w:proofErr w:type="spellEnd"/>
+      <w:r>
+        <w:rPr>
+          <w:rFonts w:ascii="Arial" w:hAnsi="Arial"/>
+          <w:sz w:val="21"/>
+          <w:lang w:val="es-CL"/>
+        </w:rPr>
+        <w:t xml:space="preserve"> de la sección 4 Consola de administración de la especificación Aprueba API </w:t>
+      </w:r>
+      <w:proofErr w:type="spellStart"/>
+      <w:r>
+        <w:rPr>
+          <w:rFonts w:ascii="Arial" w:hAnsi="Arial"/>
+          <w:sz w:val="21"/>
+          <w:lang w:val="es-CL"/>
+        </w:rPr>
+        <w:t>Backend</w:t>
+      </w:r>
+      <w:proofErr w:type="spellEnd"/>
+      <w:r>
+        <w:rPr>
+          <w:rFonts w:ascii="Arial" w:hAnsi="Arial"/>
+          <w:sz w:val="21"/>
+          <w:lang w:val="es-CL"/>
+        </w:rPr>
+        <w:t>. Comprende autenticación administrativa, métricas generales y comerciales, patrocinadores, plataformas, servicios, contenedores, usuarios, tickets, correcciones, preguntas, funcionalidades y planes. También incluye las convenciones comunes de respuesta, errores, JWT, autorización por roles, paginación y validación. La tecnología física de persistencia y los proveedores de infraestructura se definirán cuando se reciban los insumos vigentes.</w:t>
       </w:r>
     </w:p>
     <w:p>
       <w:pPr>
         <w:pStyle w:val="Ttulo2"/>
       </w:pPr>
+      <w:proofErr w:type="spellStart"/>
       <w:r>
         <w:t>Exclusiones</w:t>
       </w:r>
+      <w:proofErr w:type="spellEnd"/>
     </w:p>
     <w:p>
       <w:pPr>
@@ -873,9 +676,53 @@
           <w:between w:val="nil"/>
         </w:pBdr>
         <w:spacing w:after="0"/>
-      </w:pPr>
-      <w:r>
-        <w:t>Aplicación del alumno, generador de preguntas y landing como desarrollo principal.</w:t>
+        <w:rPr>
+          <w:lang w:val="es-CL"/>
+        </w:rPr>
+      </w:pPr>
+      <w:r>
+        <w:rPr>
+          <w:rFonts w:ascii="Arial" w:hAnsi="Arial"/>
+          <w:sz w:val="21"/>
+          <w:lang w:val="es-CL"/>
+        </w:rPr>
+        <w:t xml:space="preserve">Quedan fuera del producto el </w:t>
+      </w:r>
+      <w:proofErr w:type="spellStart"/>
+      <w:r>
+        <w:rPr>
+          <w:rFonts w:ascii="Arial" w:hAnsi="Arial"/>
+          <w:sz w:val="21"/>
+          <w:lang w:val="es-CL"/>
+        </w:rPr>
+        <w:t>backend</w:t>
+      </w:r>
+      <w:proofErr w:type="spellEnd"/>
+      <w:r>
+        <w:rPr>
+          <w:rFonts w:ascii="Arial" w:hAnsi="Arial"/>
+          <w:sz w:val="21"/>
+          <w:lang w:val="es-CL"/>
+        </w:rPr>
+        <w:t xml:space="preserve"> de la aplicación del alumno, el sitio web del alumno y el generador. Sus entidades solo se consideran cuando un </w:t>
+      </w:r>
+      <w:proofErr w:type="spellStart"/>
+      <w:r>
+        <w:rPr>
+          <w:rFonts w:ascii="Arial" w:hAnsi="Arial"/>
+          <w:sz w:val="21"/>
+          <w:lang w:val="es-CL"/>
+        </w:rPr>
+        <w:t>endpoint</w:t>
+      </w:r>
+      <w:proofErr w:type="spellEnd"/>
+      <w:r>
+        <w:rPr>
+          <w:rFonts w:ascii="Arial" w:hAnsi="Arial"/>
+          <w:sz w:val="21"/>
+          <w:lang w:val="es-CL"/>
+        </w:rPr>
+        <w:t xml:space="preserve"> administrativo necesita consultarlas o gestionarlas.</w:t>
       </w:r>
     </w:p>
     <w:p>
@@ -894,7 +741,83 @@
         <w:spacing w:after="0"/>
       </w:pPr>
       <w:r>
-        <w:t>Cobros reales, credenciales productivas, publicación del repositorio y despliegue productivo en Fase 1.</w:t>
+        <w:rPr>
+          <w:rFonts w:ascii="Arial" w:hAnsi="Arial"/>
+          <w:sz w:val="21"/>
+          <w:lang w:val="es-CL"/>
+        </w:rPr>
+        <w:t xml:space="preserve">Quedan fuera de la Fase 1 los resultados de implementación, las pruebas ejecutadas, el despliegue productivo y las integraciones externas no verificadas. </w:t>
+      </w:r>
+      <w:r>
+        <w:rPr>
+          <w:rFonts w:ascii="Arial" w:hAnsi="Arial"/>
+          <w:sz w:val="21"/>
+        </w:rPr>
+        <w:t xml:space="preserve">En </w:t>
+      </w:r>
+      <w:proofErr w:type="spellStart"/>
+      <w:r>
+        <w:rPr>
+          <w:rFonts w:ascii="Arial" w:hAnsi="Arial"/>
+          <w:sz w:val="21"/>
+        </w:rPr>
+        <w:t>esta</w:t>
+      </w:r>
+      <w:proofErr w:type="spellEnd"/>
+      <w:r>
+        <w:rPr>
+          <w:rFonts w:ascii="Arial" w:hAnsi="Arial"/>
+          <w:sz w:val="21"/>
+        </w:rPr>
+        <w:t xml:space="preserve"> </w:t>
+      </w:r>
+      <w:proofErr w:type="spellStart"/>
+      <w:r>
+        <w:rPr>
+          <w:rFonts w:ascii="Arial" w:hAnsi="Arial"/>
+          <w:sz w:val="21"/>
+        </w:rPr>
+        <w:t>fase</w:t>
+      </w:r>
+      <w:proofErr w:type="spellEnd"/>
+      <w:r>
+        <w:rPr>
+          <w:rFonts w:ascii="Arial" w:hAnsi="Arial"/>
+          <w:sz w:val="21"/>
+        </w:rPr>
+        <w:t xml:space="preserve"> se </w:t>
+      </w:r>
+      <w:proofErr w:type="spellStart"/>
+      <w:r>
+        <w:rPr>
+          <w:rFonts w:ascii="Arial" w:hAnsi="Arial"/>
+          <w:sz w:val="21"/>
+        </w:rPr>
+        <w:t>definen</w:t>
+      </w:r>
+      <w:proofErr w:type="spellEnd"/>
+      <w:r>
+        <w:rPr>
+          <w:rFonts w:ascii="Arial" w:hAnsi="Arial"/>
+          <w:sz w:val="21"/>
+        </w:rPr>
+        <w:t xml:space="preserve"> y </w:t>
+      </w:r>
+      <w:proofErr w:type="spellStart"/>
+      <w:r>
+        <w:rPr>
+          <w:rFonts w:ascii="Arial" w:hAnsi="Arial"/>
+          <w:sz w:val="21"/>
+        </w:rPr>
+        <w:t>planifican</w:t>
+      </w:r>
+      <w:proofErr w:type="spellEnd"/>
+      <w:r>
+        <w:rPr>
+          <w:rFonts w:ascii="Arial" w:hAnsi="Arial"/>
+          <w:sz w:val="21"/>
+        </w:rPr>
+        <w:t>.</w:t>
       </w:r>
     </w:p>
     <w:p>
@@ -911,9 +834,35 @@
           <w:between w:val="nil"/>
         </w:pBdr>
         <w:spacing w:after="0"/>
-      </w:pPr>
-      <w:r>
-        <w:t>Operación real de contenedores: el reinicio existente es una simulación documentada.</w:t>
+        <w:rPr>
+          <w:lang w:val="es-CL"/>
+        </w:rPr>
+      </w:pPr>
+      <w:r>
+        <w:rPr>
+          <w:rFonts w:ascii="Arial" w:hAnsi="Arial"/>
+          <w:sz w:val="21"/>
+          <w:lang w:val="es-CL"/>
+        </w:rPr>
+        <w:t xml:space="preserve">Un </w:t>
+      </w:r>
+      <w:proofErr w:type="spellStart"/>
+      <w:r>
+        <w:rPr>
+          <w:rFonts w:ascii="Arial" w:hAnsi="Arial"/>
+          <w:sz w:val="21"/>
+          <w:lang w:val="es-CL"/>
+        </w:rPr>
+        <w:t>frontend</w:t>
+      </w:r>
+      <w:proofErr w:type="spellEnd"/>
+      <w:r>
+        <w:rPr>
+          <w:rFonts w:ascii="Arial" w:hAnsi="Arial"/>
+          <w:sz w:val="21"/>
+          <w:lang w:val="es-CL"/>
+        </w:rPr>
+        <w:t xml:space="preserve"> completo no forma parte del alcance. El equipo podrá preparar un cliente mínimo para demostrar solicitudes a la API si la evaluación lo requiere.</w:t>
       </w:r>
     </w:p>
     <w:p>
@@ -929,22 +878,118 @@
           <w:right w:val="nil"/>
           <w:between w:val="nil"/>
         </w:pBdr>
-      </w:pPr>
-      <w:r>
-        <w:t>Machine Learning como característica del MVP; se mantiene como interés formativo y oportunidad futura.</w:t>
+        <w:rPr>
+          <w:lang w:val="es-CL"/>
+        </w:rPr>
+      </w:pPr>
+      <w:r>
+        <w:rPr>
+          <w:rFonts w:ascii="Arial" w:hAnsi="Arial"/>
+          <w:sz w:val="21"/>
+          <w:lang w:val="es-CL"/>
+        </w:rPr>
+        <w:t xml:space="preserve">Machine </w:t>
+      </w:r>
+      <w:proofErr w:type="spellStart"/>
+      <w:r>
+        <w:rPr>
+          <w:rFonts w:ascii="Arial" w:hAnsi="Arial"/>
+          <w:sz w:val="21"/>
+          <w:lang w:val="es-CL"/>
+        </w:rPr>
+        <w:t>Learning</w:t>
+      </w:r>
+      <w:proofErr w:type="spellEnd"/>
+      <w:r>
+        <w:rPr>
+          <w:rFonts w:ascii="Arial" w:hAnsi="Arial"/>
+          <w:sz w:val="21"/>
+          <w:lang w:val="es-CL"/>
+        </w:rPr>
+        <w:t xml:space="preserve"> se conserva como interés formativo del equipo y posible línea futura. No forma parte de los 27 </w:t>
+      </w:r>
+      <w:proofErr w:type="spellStart"/>
+      <w:r>
+        <w:rPr>
+          <w:rFonts w:ascii="Arial" w:hAnsi="Arial"/>
+          <w:sz w:val="21"/>
+          <w:lang w:val="es-CL"/>
+        </w:rPr>
+        <w:t>endpoints</w:t>
+      </w:r>
+      <w:proofErr w:type="spellEnd"/>
+      <w:r>
+        <w:rPr>
+          <w:rFonts w:ascii="Arial" w:hAnsi="Arial"/>
+          <w:sz w:val="21"/>
+          <w:lang w:val="es-CL"/>
+        </w:rPr>
+        <w:t xml:space="preserve"> ni del producto comprometido.</w:t>
       </w:r>
     </w:p>
     <w:p>
       <w:pPr>
         <w:pStyle w:val="Ttulo1"/>
-      </w:pPr>
-      <w:r>
+        <w:rPr>
+          <w:lang w:val="es-CL"/>
+        </w:rPr>
+      </w:pPr>
+      <w:r>
+        <w:rPr>
+          <w:lang w:val="es-CL"/>
+        </w:rPr>
         <w:t>3. Objetivos</w:t>
       </w:r>
     </w:p>
     <w:p>
-      <w:r>
-        <w:t>Desarrollar y validar una consola web de administración para Aprueba que centralice la supervisión del negocio y la operación, aplicando arquitectura web full-stack, control de acceso por roles, persistencia documental, seguridad, pruebas y gestión ágil durante las 18 semanas del proyecto CAPSTONE.</w:t>
+      <w:pPr>
+        <w:rPr>
+          <w:lang w:val="es-CL"/>
+        </w:rPr>
+      </w:pPr>
+      <w:r>
+        <w:rPr>
+          <w:rFonts w:ascii="Arial" w:hAnsi="Arial"/>
+          <w:sz w:val="21"/>
+          <w:lang w:val="es-CL"/>
+        </w:rPr>
+        <w:t xml:space="preserve">Diseñar, desarrollar y validar el </w:t>
+      </w:r>
+      <w:proofErr w:type="spellStart"/>
+      <w:r>
+        <w:rPr>
+          <w:rFonts w:ascii="Arial" w:hAnsi="Arial"/>
+          <w:sz w:val="21"/>
+          <w:lang w:val="es-CL"/>
+        </w:rPr>
+        <w:t>backend</w:t>
+      </w:r>
+      <w:proofErr w:type="spellEnd"/>
+      <w:r>
+        <w:rPr>
+          <w:rFonts w:ascii="Arial" w:hAnsi="Arial"/>
+          <w:sz w:val="21"/>
+          <w:lang w:val="es-CL"/>
+        </w:rPr>
+        <w:t xml:space="preserve"> de Aprueba Administración durante 18 semanas, implementando los 27 </w:t>
+      </w:r>
+      <w:proofErr w:type="spellStart"/>
+      <w:r>
+        <w:rPr>
+          <w:rFonts w:ascii="Arial" w:hAnsi="Arial"/>
+          <w:sz w:val="21"/>
+          <w:lang w:val="es-CL"/>
+        </w:rPr>
+        <w:t>endpoints</w:t>
+      </w:r>
+      <w:proofErr w:type="spellEnd"/>
+      <w:r>
+        <w:rPr>
+          <w:rFonts w:ascii="Arial" w:hAnsi="Arial"/>
+          <w:sz w:val="21"/>
+          <w:lang w:val="es-CL"/>
+        </w:rPr>
+        <w:t xml:space="preserve"> administrativos del contrato API con control de acceso por roles, validación, trazabilidad, pruebas automatizadas y una ruta de despliegue reproducible.</w:t>
       </w:r>
     </w:p>
     <w:p>
@@ -961,9 +1006,35 @@
           <w:between w:val="nil"/>
         </w:pBdr>
         <w:spacing w:after="0"/>
-      </w:pPr>
-      <w:r>
-        <w:t>Levantar y priorizar requisitos funcionales y no funcionales para los ocho módulos administrativos.</w:t>
+        <w:rPr>
+          <w:lang w:val="es-CL"/>
+        </w:rPr>
+      </w:pPr>
+      <w:r>
+        <w:rPr>
+          <w:rFonts w:ascii="Arial" w:hAnsi="Arial"/>
+          <w:sz w:val="21"/>
+          <w:lang w:val="es-CL"/>
+        </w:rPr>
+        <w:t xml:space="preserve">Especificar y priorizar los requisitos funcionales y no funcionales asociados a los 27 </w:t>
+      </w:r>
+      <w:proofErr w:type="spellStart"/>
+      <w:r>
+        <w:rPr>
+          <w:rFonts w:ascii="Arial" w:hAnsi="Arial"/>
+          <w:sz w:val="21"/>
+          <w:lang w:val="es-CL"/>
+        </w:rPr>
+        <w:t>endpoints</w:t>
+      </w:r>
+      <w:proofErr w:type="spellEnd"/>
+      <w:r>
+        <w:rPr>
+          <w:rFonts w:ascii="Arial" w:hAnsi="Arial"/>
+          <w:sz w:val="21"/>
+          <w:lang w:val="es-CL"/>
+        </w:rPr>
+        <w:t xml:space="preserve"> administrativos.</w:t>
       </w:r>
     </w:p>
     <w:p>
@@ -980,9 +1051,35 @@
           <w:between w:val="nil"/>
         </w:pBdr>
         <w:spacing w:after="0"/>
-      </w:pPr>
-      <w:r>
-        <w:t>Consolidar una arquitectura React, Express y Firestore con contrato REST versionado y RBAC.</w:t>
+        <w:rPr>
+          <w:lang w:val="es-CL"/>
+        </w:rPr>
+      </w:pPr>
+      <w:r>
+        <w:rPr>
+          <w:rFonts w:ascii="Arial" w:hAnsi="Arial"/>
+          <w:sz w:val="21"/>
+          <w:lang w:val="es-CL"/>
+        </w:rPr>
+        <w:t xml:space="preserve">Diseñar una arquitectura desacoplada del proveedor, con capas para API, seguridad, lógica de aplicación, persistencia, integraciones y </w:t>
+      </w:r>
+      <w:proofErr w:type="spellStart"/>
+      <w:r>
+        <w:rPr>
+          <w:rFonts w:ascii="Arial" w:hAnsi="Arial"/>
+          <w:sz w:val="21"/>
+          <w:lang w:val="es-CL"/>
+        </w:rPr>
+        <w:t>observabilidad</w:t>
+      </w:r>
+      <w:proofErr w:type="spellEnd"/>
+      <w:r>
+        <w:rPr>
+          <w:rFonts w:ascii="Arial" w:hAnsi="Arial"/>
+          <w:sz w:val="21"/>
+          <w:lang w:val="es-CL"/>
+        </w:rPr>
+        <w:t>.</w:t>
       </w:r>
     </w:p>
     <w:p>
@@ -999,9 +1096,17 @@
           <w:between w:val="nil"/>
         </w:pBdr>
         <w:spacing w:after="0"/>
-      </w:pPr>
-      <w:r>
-        <w:t>Implementar y verificar los flujos de autenticación, métricas, sponsors, operación, usuarios, soporte, tutores, contenido y planes.</w:t>
+        <w:rPr>
+          <w:lang w:val="es-CL"/>
+        </w:rPr>
+      </w:pPr>
+      <w:r>
+        <w:rPr>
+          <w:rFonts w:ascii="Arial" w:hAnsi="Arial"/>
+          <w:sz w:val="21"/>
+          <w:lang w:val="es-CL"/>
+        </w:rPr>
+        <w:t>Planificar e implementar de forma incremental los módulos de autenticación, métricas, patrocinadores, operación, usuarios, soporte, contenido y planes.</w:t>
       </w:r>
     </w:p>
     <w:p>
@@ -1018,9 +1123,17 @@
           <w:between w:val="nil"/>
         </w:pBdr>
         <w:spacing w:after="0"/>
-      </w:pPr>
-      <w:r>
-        <w:t>Diseñar y ejecutar una estrategia progresiva de pruebas, seguridad, accesibilidad y rendimiento.</w:t>
+        <w:rPr>
+          <w:lang w:val="es-CL"/>
+        </w:rPr>
+      </w:pPr>
+      <w:r>
+        <w:rPr>
+          <w:rFonts w:ascii="Arial" w:hAnsi="Arial"/>
+          <w:sz w:val="21"/>
+          <w:lang w:val="es-CL"/>
+        </w:rPr>
+        <w:t>Preparar y ejecutar pruebas unitarias, de contrato, integración, autorización, validación, regresión y solicitudes negativas.</w:t>
       </w:r>
     </w:p>
     <w:p>
@@ -1036,16 +1149,31 @@
           <w:right w:val="nil"/>
           <w:between w:val="nil"/>
         </w:pBdr>
-      </w:pPr>
-      <w:r>
-        <w:t>Preparar una ruta reproducible de contenerización, integración continua y despliegue sin exponer secretos.</w:t>
+        <w:rPr>
+          <w:lang w:val="es-CL"/>
+        </w:rPr>
+      </w:pPr>
+      <w:r>
+        <w:rPr>
+          <w:rFonts w:ascii="Arial" w:hAnsi="Arial"/>
+          <w:sz w:val="21"/>
+          <w:lang w:val="es-CL"/>
+        </w:rPr>
+        <w:t>Preparar ambientes de desarrollo, pruebas y producción, además de documentación de ejecución y despliegue, sin exponer secretos ni asumir un proveedor no confirmado.</w:t>
       </w:r>
     </w:p>
     <w:p>
       <w:pPr>
         <w:pStyle w:val="Ttulo1"/>
-      </w:pPr>
-      <w:r>
+        <w:rPr>
+          <w:lang w:val="es-CL"/>
+        </w:rPr>
+      </w:pPr>
+      <w:r>
+        <w:rPr>
+          <w:lang w:val="es-CL"/>
+        </w:rPr>
+        <w:lastRenderedPageBreak/>
         <w:t>4. Pertinencia con el perfil de egreso</w:t>
       </w:r>
     </w:p>
@@ -1080,6 +1208,7 @@
             <w:pPr>
               <w:spacing w:after="20" w:line="240" w:lineRule="auto"/>
             </w:pPr>
+            <w:proofErr w:type="spellStart"/>
             <w:r>
               <w:rPr>
                 <w:b/>
@@ -1090,6 +1219,7 @@
               </w:rPr>
               <w:t>Competencia</w:t>
             </w:r>
+            <w:proofErr w:type="spellEnd"/>
           </w:p>
         </w:tc>
         <w:tc>
@@ -1106,6 +1236,7 @@
             <w:pPr>
               <w:spacing w:after="20" w:line="240" w:lineRule="auto"/>
             </w:pPr>
+            <w:proofErr w:type="spellStart"/>
             <w:r>
               <w:rPr>
                 <w:b/>
@@ -1115,6 +1246,62 @@
                 <w:szCs w:val="17"/>
               </w:rPr>
               <w:t>Aplicación</w:t>
+            </w:r>
+            <w:proofErr w:type="spellEnd"/>
+          </w:p>
+        </w:tc>
+      </w:tr>
+      <w:tr>
+        <w:trPr>
+          <w:jc w:val="center"/>
+        </w:trPr>
+        <w:tc>
+          <w:tcPr>
+            <w:tcW w:w="4882" w:type="dxa"/>
+            <w:tcMar>
+              <w:top w:w="80" w:type="dxa"/>
+              <w:bottom w:w="80" w:type="dxa"/>
+            </w:tcMar>
+            <w:vAlign w:val="center"/>
+          </w:tcPr>
+          <w:p>
+            <w:pPr>
+              <w:rPr>
+                <w:lang w:val="es-CL"/>
+              </w:rPr>
+            </w:pPr>
+            <w:r>
+              <w:rPr>
+                <w:rFonts w:ascii="Arial" w:hAnsi="Arial"/>
+                <w:sz w:val="18"/>
+                <w:lang w:val="es-CL"/>
+              </w:rPr>
+              <w:t>Desarrollar una solución de software mediante un proceso sistemático de desarrollo y mantenimiento.</w:t>
+            </w:r>
+          </w:p>
+        </w:tc>
+        <w:tc>
+          <w:tcPr>
+            <w:tcW w:w="4882" w:type="dxa"/>
+            <w:tcMar>
+              <w:top w:w="80" w:type="dxa"/>
+              <w:bottom w:w="80" w:type="dxa"/>
+            </w:tcMar>
+            <w:vAlign w:val="center"/>
+          </w:tcPr>
+          <w:p>
+            <w:pPr>
+              <w:rPr>
+                <w:lang w:val="es-CL"/>
+              </w:rPr>
+            </w:pPr>
+            <w:r>
+              <w:rPr>
+                <w:rFonts w:ascii="Arial" w:hAnsi="Arial"/>
+                <w:sz w:val="18"/>
+                <w:lang w:val="es-CL"/>
+              </w:rPr>
+              <w:t>Diseño e implementación incremental de la API administrativa, sus servicios y adaptadores.</w:t>
             </w:r>
           </w:p>
         </w:tc>
@@ -1134,14 +1321,17 @@
           </w:tcPr>
           <w:p>
             <w:pPr>
-              <w:spacing w:after="20" w:line="240" w:lineRule="auto"/>
+              <w:rPr>
+                <w:lang w:val="es-CL"/>
+              </w:rPr>
             </w:pPr>
             <w:r>
               <w:rPr>
-                <w:sz w:val="17"/>
-                <w:szCs w:val="17"/>
+                <w:rFonts w:ascii="Arial" w:hAnsi="Arial"/>
+                <w:sz w:val="18"/>
+                <w:lang w:val="es-CL"/>
               </w:rPr>
-              <w:t>Desarrollar una solución de software mediante un proceso sistemático de desarrollo y mantenimiento.</w:t>
+              <w:t>Construir modelos de datos escalables de acuerdo con los requerimientos de la organización.</w:t>
             </w:r>
           </w:p>
         </w:tc>
@@ -1156,14 +1346,17 @@
           </w:tcPr>
           <w:p>
             <w:pPr>
-              <w:spacing w:after="20" w:line="240" w:lineRule="auto"/>
+              <w:rPr>
+                <w:lang w:val="es-CL"/>
+              </w:rPr>
             </w:pPr>
             <w:r>
               <w:rPr>
-                <w:sz w:val="17"/>
-                <w:szCs w:val="17"/>
+                <w:rFonts w:ascii="Arial" w:hAnsi="Arial"/>
+                <w:sz w:val="18"/>
+                <w:lang w:val="es-CL"/>
               </w:rPr>
-              <w:t>Construcción e integración de frontend, backend y API.</w:t>
+              <w:t>Modelo lógico y capa de persistencia independientes de la tecnología física pendiente.</w:t>
             </w:r>
           </w:p>
         </w:tc>
@@ -1183,15 +1376,17 @@
           </w:tcPr>
           <w:p>
             <w:pPr>
-              <w:spacing w:after="20" w:line="240" w:lineRule="auto"/>
+              <w:rPr>
+                <w:lang w:val="es-CL"/>
+              </w:rPr>
             </w:pPr>
             <w:r>
               <w:rPr>
-                <w:sz w:val="17"/>
-                <w:szCs w:val="17"/>
+                <w:rFonts w:ascii="Arial" w:hAnsi="Arial"/>
+                <w:sz w:val="18"/>
+                <w:lang w:val="es-CL"/>
               </w:rPr>
-              <w:lastRenderedPageBreak/>
-              <w:t>Construir modelos de datos escalables de acuerdo con los requerimientos de la organización.</w:t>
+              <w:t>Realizar pruebas de certificación de productos y procesos con buenas prácticas de la industria.</w:t>
             </w:r>
           </w:p>
         </w:tc>
@@ -1206,14 +1401,17 @@
           </w:tcPr>
           <w:p>
             <w:pPr>
-              <w:spacing w:after="20" w:line="240" w:lineRule="auto"/>
+              <w:rPr>
+                <w:lang w:val="es-CL"/>
+              </w:rPr>
             </w:pPr>
             <w:r>
               <w:rPr>
-                <w:sz w:val="17"/>
-                <w:szCs w:val="17"/>
+                <w:rFonts w:ascii="Arial" w:hAnsi="Arial"/>
+                <w:sz w:val="18"/>
+                <w:lang w:val="es-CL"/>
               </w:rPr>
-              <w:t>Modelo documental y colecciones administrativas Firestore.</w:t>
+              <w:t>Pruebas unitarias, de contrato, integración, autorización, validación y regresión.</w:t>
             </w:r>
           </w:p>
         </w:tc>
@@ -1233,14 +1431,17 @@
           </w:tcPr>
           <w:p>
             <w:pPr>
-              <w:spacing w:after="20" w:line="240" w:lineRule="auto"/>
+              <w:rPr>
+                <w:lang w:val="es-CL"/>
+              </w:rPr>
             </w:pPr>
             <w:r>
               <w:rPr>
-                <w:sz w:val="17"/>
-                <w:szCs w:val="17"/>
+                <w:rFonts w:ascii="Arial" w:hAnsi="Arial"/>
+                <w:sz w:val="18"/>
+                <w:lang w:val="es-CL"/>
               </w:rPr>
-              <w:t>Realizar pruebas de certificación de productos y procesos con buenas prácticas de la industria.</w:t>
+              <w:t>Construir el modelo arquitectónico de una solución sistémica conforme a estándares de la industria.</w:t>
             </w:r>
           </w:p>
         </w:tc>
@@ -1255,14 +1456,17 @@
           </w:tcPr>
           <w:p>
             <w:pPr>
-              <w:spacing w:after="20" w:line="240" w:lineRule="auto"/>
+              <w:rPr>
+                <w:lang w:val="es-CL"/>
+              </w:rPr>
             </w:pPr>
             <w:r>
               <w:rPr>
-                <w:sz w:val="17"/>
-                <w:szCs w:val="17"/>
+                <w:rFonts w:ascii="Arial" w:hAnsi="Arial"/>
+                <w:sz w:val="18"/>
+                <w:lang w:val="es-CL"/>
               </w:rPr>
-              <w:t>Estrategia y casos de prueba con trazabilidad.</w:t>
+              <w:t>Diagramas de contexto, componentes, casos de uso, secuencia, despliegue y datos.</w:t>
             </w:r>
           </w:p>
         </w:tc>
@@ -1282,61 +1486,15 @@
           </w:tcPr>
           <w:p>
             <w:pPr>
-              <w:spacing w:after="20" w:line="240" w:lineRule="auto"/>
+              <w:rPr>
+                <w:lang w:val="es-CL"/>
+              </w:rPr>
             </w:pPr>
             <w:r>
               <w:rPr>
-                <w:sz w:val="17"/>
-                <w:szCs w:val="17"/>
-              </w:rPr>
-              <w:t>Construir el modelo arquitectónico de una solución sistémica conforme a estándares de la industria.</w:t>
-            </w:r>
-          </w:p>
-        </w:tc>
-        <w:tc>
-          <w:tcPr>
-            <w:tcW w:w="4882" w:type="dxa"/>
-            <w:tcMar>
-              <w:top w:w="80" w:type="dxa"/>
-              <w:bottom w:w="80" w:type="dxa"/>
-            </w:tcMar>
-            <w:vAlign w:val="center"/>
-          </w:tcPr>
-          <w:p>
-            <w:pPr>
-              <w:spacing w:after="20" w:line="240" w:lineRule="auto"/>
-            </w:pPr>
-            <w:r>
-              <w:rPr>
-                <w:sz w:val="17"/>
-                <w:szCs w:val="17"/>
-              </w:rPr>
-              <w:t>Diagramas de contexto, componentes, secuencia y despliegue.</w:t>
-            </w:r>
-          </w:p>
-        </w:tc>
-      </w:tr>
-      <w:tr>
-        <w:trPr>
-          <w:jc w:val="center"/>
-        </w:trPr>
-        <w:tc>
-          <w:tcPr>
-            <w:tcW w:w="4882" w:type="dxa"/>
-            <w:tcMar>
-              <w:top w:w="80" w:type="dxa"/>
-              <w:bottom w:w="80" w:type="dxa"/>
-            </w:tcMar>
-            <w:vAlign w:val="center"/>
-          </w:tcPr>
-          <w:p>
-            <w:pPr>
-              <w:spacing w:after="20" w:line="240" w:lineRule="auto"/>
-            </w:pPr>
-            <w:r>
-              <w:rPr>
-                <w:sz w:val="17"/>
-                <w:szCs w:val="17"/>
+                <w:rFonts w:ascii="Arial" w:hAnsi="Arial"/>
+                <w:sz w:val="18"/>
+                <w:lang w:val="es-CL"/>
               </w:rPr>
               <w:t>Resolver vulnerabilidades sistémicas y gestionar proyectos informáticos para apoyar la toma de decisiones.</w:t>
             </w:r>
@@ -1353,92 +1511,418 @@
           </w:tcPr>
           <w:p>
             <w:pPr>
-              <w:spacing w:after="20" w:line="240" w:lineRule="auto"/>
+              <w:rPr>
+                <w:lang w:val="es-CL"/>
+              </w:rPr>
             </w:pPr>
             <w:r>
               <w:rPr>
-                <w:sz w:val="17"/>
-                <w:szCs w:val="17"/>
+                <w:rFonts w:ascii="Arial" w:hAnsi="Arial"/>
+                <w:sz w:val="18"/>
+                <w:lang w:val="es-CL"/>
               </w:rPr>
-              <w:t>RBAC, protección de secretos, RAID, backlog y decisiones.</w:t>
+              <w:t>JWT, control de acceso por roles, protección de secretos, backlog, RAID, RACI y seguimiento semanal.</w:t>
             </w:r>
           </w:p>
         </w:tc>
       </w:tr>
     </w:tbl>
-    <w:p/>
     <w:p>
       <w:pPr>
-        <w:pStyle w:val="Ttulo1"/>
+        <w:rPr>
+          <w:lang w:val="es-CL"/>
+        </w:rPr>
       </w:pPr>
     </w:p>
     <w:p>
       <w:pPr>
         <w:pStyle w:val="Ttulo1"/>
         <w:rPr>
+          <w:lang w:val="es-CL"/>
+        </w:rPr>
+      </w:pPr>
+    </w:p>
+    <w:p>
+      <w:pPr>
+        <w:pStyle w:val="Ttulo1"/>
+        <w:rPr>
           <w:i/>
           <w:iCs/>
-        </w:rPr>
-      </w:pPr>
-      <w:r>
+          <w:lang w:val="es-CL"/>
+        </w:rPr>
+      </w:pPr>
+      <w:r>
+        <w:rPr>
+          <w:lang w:val="es-CL"/>
+        </w:rPr>
         <w:t xml:space="preserve">5. Intereses profesionales </w:t>
       </w:r>
     </w:p>
     <w:p>
       <w:pPr>
         <w:pStyle w:val="Ttulo2"/>
-      </w:pPr>
-      <w:r>
+        <w:rPr>
+          <w:lang w:val="es-CL"/>
+        </w:rPr>
+      </w:pPr>
+      <w:r>
+        <w:rPr>
+          <w:lang w:val="es-CL"/>
+        </w:rPr>
         <w:t>Tsung-Hao Liu</w:t>
       </w:r>
     </w:p>
     <w:p>
-      <w:r>
+      <w:pPr>
+        <w:rPr>
+          <w:lang w:val="es-CL"/>
+        </w:rPr>
+      </w:pPr>
+      <w:r>
+        <w:rPr>
+          <w:rFonts w:ascii="Arial" w:hAnsi="Arial"/>
+          <w:sz w:val="21"/>
+          <w:lang w:val="es-CL"/>
+        </w:rPr>
+        <w:t xml:space="preserve">Mis intereses profesionales se orientan al desarrollo de aplicaciones web, especialmente al </w:t>
+      </w:r>
+      <w:proofErr w:type="spellStart"/>
+      <w:r>
+        <w:rPr>
+          <w:rFonts w:ascii="Arial" w:hAnsi="Arial"/>
+          <w:sz w:val="21"/>
+          <w:lang w:val="es-CL"/>
+        </w:rPr>
+        <w:t>backend</w:t>
+      </w:r>
+      <w:proofErr w:type="spellEnd"/>
+      <w:r>
+        <w:rPr>
+          <w:rFonts w:ascii="Arial" w:hAnsi="Arial"/>
+          <w:sz w:val="21"/>
+          <w:lang w:val="es-CL"/>
+        </w:rPr>
+        <w:t xml:space="preserve">, la organización de proyectos y la integración con bases de datos. En el Proyecto APT se reflejan en la planificación de la API administrativa, el control de acceso, las validaciones y la preparación del proceso de pruebas y despliegue. Machine </w:t>
+      </w:r>
+      <w:proofErr w:type="spellStart"/>
+      <w:r>
+        <w:rPr>
+          <w:rFonts w:ascii="Arial" w:hAnsi="Arial"/>
+          <w:sz w:val="21"/>
+          <w:lang w:val="es-CL"/>
+        </w:rPr>
+        <w:t>Learning</w:t>
+      </w:r>
+      <w:proofErr w:type="spellEnd"/>
+      <w:r>
+        <w:rPr>
+          <w:rFonts w:ascii="Arial" w:hAnsi="Arial"/>
+          <w:sz w:val="21"/>
+          <w:lang w:val="es-CL"/>
+        </w:rPr>
+        <w:t xml:space="preserve"> se mantiene como un interés de formación futura, fuera del alcance de esta versión.</w:t>
+      </w:r>
+    </w:p>
+    <w:p>
+      <w:pPr>
+        <w:pStyle w:val="Ttulo2"/>
+        <w:rPr>
+          <w:lang w:val="es-CL"/>
+        </w:rPr>
+      </w:pPr>
+      <w:r>
+        <w:rPr>
+          <w:lang w:val="es-CL"/>
+        </w:rPr>
+        <w:t>Catalina Yanara Padilla Astudillo</w:t>
+      </w:r>
+    </w:p>
+    <w:p>
+      <w:pPr>
+        <w:rPr>
+          <w:lang w:val="es-CL"/>
+        </w:rPr>
+      </w:pPr>
+      <w:r>
+        <w:rPr>
+          <w:rFonts w:ascii="Arial" w:hAnsi="Arial"/>
+          <w:sz w:val="21"/>
+          <w:lang w:val="es-CL"/>
+        </w:rPr>
+        <w:t xml:space="preserve">Mis intereses profesionales están orientados al análisis, la organización de información y Machine </w:t>
+      </w:r>
+      <w:proofErr w:type="spellStart"/>
+      <w:r>
+        <w:rPr>
+          <w:rFonts w:ascii="Arial" w:hAnsi="Arial"/>
+          <w:sz w:val="21"/>
+          <w:lang w:val="es-CL"/>
+        </w:rPr>
+        <w:t>Learning</w:t>
+      </w:r>
+      <w:proofErr w:type="spellEnd"/>
+      <w:r>
+        <w:rPr>
+          <w:rFonts w:ascii="Arial" w:hAnsi="Arial"/>
+          <w:sz w:val="21"/>
+          <w:lang w:val="es-CL"/>
+        </w:rPr>
+        <w:t xml:space="preserve">. En el Proyecto APT se reflejan en el levantamiento de reglas, la definición de criterios de aceptación y el diseño lógico de los datos que necesitan los </w:t>
+      </w:r>
+      <w:proofErr w:type="spellStart"/>
+      <w:r>
+        <w:rPr>
+          <w:rFonts w:ascii="Arial" w:hAnsi="Arial"/>
+          <w:sz w:val="21"/>
+          <w:lang w:val="es-CL"/>
+        </w:rPr>
+        <w:t>endpoints</w:t>
+      </w:r>
+      <w:proofErr w:type="spellEnd"/>
+      <w:r>
+        <w:rPr>
+          <w:rFonts w:ascii="Arial" w:hAnsi="Arial"/>
+          <w:sz w:val="21"/>
+          <w:lang w:val="es-CL"/>
+        </w:rPr>
+        <w:t xml:space="preserve"> administrativos. La tecnología física de la base de datos se definirá cuando la contraparte entregue el insumo vigente.</w:t>
+      </w:r>
+    </w:p>
+    <w:p>
+      <w:pPr>
+        <w:pStyle w:val="Ttulo2"/>
+        <w:rPr>
+          <w:lang w:val="es-CL"/>
+        </w:rPr>
+      </w:pPr>
+      <w:r>
+        <w:rPr>
+          <w:lang w:val="es-CL"/>
+        </w:rPr>
+        <w:t>Felipe Antonio Rojas Riffo</w:t>
+      </w:r>
+    </w:p>
+    <w:p>
+      <w:pPr>
         <w:rPr>
           <w:i/>
           <w:iCs/>
-        </w:rPr>
-        <w:t xml:space="preserve">Mis intereses profesionales se orientan al desarrollo backend y la administración de sistemas en la nube. En el Proyecto APT, estos intereses se reflejan en el desarrollo de la API, la implementación de mecanismos de autenticación y control de acceso, y la configuración de los procesos de integración y despliegue. También me interesa aplicar técnicas de machine learning en futuros módulos de análisis y apoyo a la toma de decisiones. </w:t>
+          <w:lang w:val="es-CL"/>
+        </w:rPr>
+      </w:pPr>
+      <w:r>
+        <w:rPr>
+          <w:rFonts w:ascii="Arial" w:hAnsi="Arial"/>
+          <w:sz w:val="21"/>
+          <w:lang w:val="es-CL"/>
+        </w:rPr>
+        <w:t xml:space="preserve">Mis intereses profesionales se orientan a la arquitectura de software, el aseguramiento de calidad y las prácticas de operación. En el Proyecto APT se reflejan en el diseño de componentes del </w:t>
+      </w:r>
+      <w:proofErr w:type="spellStart"/>
+      <w:r>
+        <w:rPr>
+          <w:rFonts w:ascii="Arial" w:hAnsi="Arial"/>
+          <w:sz w:val="21"/>
+          <w:lang w:val="es-CL"/>
+        </w:rPr>
+        <w:t>backend</w:t>
+      </w:r>
+      <w:proofErr w:type="spellEnd"/>
+      <w:r>
+        <w:rPr>
+          <w:rFonts w:ascii="Arial" w:hAnsi="Arial"/>
+          <w:sz w:val="21"/>
+          <w:lang w:val="es-CL"/>
+        </w:rPr>
+        <w:t>, la planificación de pruebas y la preparación de criterios para integrar, desplegar y monitorear la API. Las herramientas concretas se seleccionarán después de revisar el código y los ambientes vigentes.</w:t>
       </w:r>
     </w:p>
     <w:p>
       <w:pPr>
-        <w:pStyle w:val="Ttulo2"/>
-      </w:pPr>
-      <w:r>
-        <w:t>Catalina Yanara Padilla Astudillo</w:t>
+        <w:pStyle w:val="Ttulo1"/>
+        <w:rPr>
+          <w:lang w:val="es-CL"/>
+        </w:rPr>
+      </w:pPr>
+      <w:r>
+        <w:rPr>
+          <w:lang w:val="es-CL"/>
+        </w:rPr>
+        <w:lastRenderedPageBreak/>
+        <w:t>6. Factibilidad</w:t>
       </w:r>
     </w:p>
     <w:p>
-      <w:r>
-        <w:rPr>
-          <w:i/>
-          <w:iCs/>
-        </w:rPr>
-        <w:t xml:space="preserve">Mis intereses profesionales están orientados a los datos y el machine learning. En el Proyecto APT, estos intereses se reflejan en el diseño del banco de preguntas y el constructor de planes sobre Firestore, estructurando la información que luego alimenta los indicadores de negocio. También me interesa explorar analítica predictiva sobre estos datos en futuras etapas. </w:t>
+      <w:pPr>
+        <w:rPr>
+          <w:lang w:val="es-CL"/>
+        </w:rPr>
+      </w:pPr>
+      <w:r>
+        <w:rPr>
+          <w:rFonts w:ascii="Arial" w:hAnsi="Arial"/>
+          <w:sz w:val="21"/>
+          <w:lang w:val="es-CL"/>
+        </w:rPr>
+        <w:t>El proyecto es factible como planificación de 18 semanas porque el contrato delimita 27 operaciones administrativas y permite dividirlas en cinco incrementos. El equipo dispone de competencias de desarrollo, datos, gestión y calidad. La factibilidad técnica definitiva depende de recibir el código vigente, la base de datos, las credenciales y la información de despliegue. Hasta entonces, la arquitectura se mantiene neutral respecto del proveedor y las actividades dependientes se registran como pendientes de insumo.</w:t>
       </w:r>
     </w:p>
     <w:p>
       <w:pPr>
-        <w:pStyle w:val="Ttulo2"/>
-      </w:pPr>
-      <w:r>
-        <w:t>Felipe Antonio Rojas Riffo</w:t>
+        <w:pStyle w:val="Ttulo1"/>
+        <w:rPr>
+          <w:lang w:val="es-CL"/>
+        </w:rPr>
+      </w:pPr>
+      <w:r>
+        <w:rPr>
+          <w:lang w:val="es-CL"/>
+        </w:rPr>
+        <w:t>7. Metodología</w:t>
       </w:r>
     </w:p>
     <w:p>
       <w:pPr>
         <w:rPr>
-          <w:i/>
-          <w:iCs/>
-        </w:rPr>
-      </w:pPr>
-      <w:r>
-        <w:rPr>
-          <w:i/>
-          <w:iCs/>
-        </w:rPr>
-        <w:t>Mis intereses profesionales se orientan a la arquitectura de software, el aseguramiento de la calidad (QA) y las prácticas DevOps. En el Proyecto APT, estos intereses se reflejan en el desarrollo de los módulos de operación y soporte para usuarios, la co-creación de la estructura del banco de preguntas y planes, y el liderazgo en las fases de pruebas de seguridad y rendimiento, así como el despliegue del sistema utilizando Docker y CI/CD. También me interesa profundizar en la automatización de procesos operativos y la creación de infraestructuras altamente escalables.</w:t>
+          <w:lang w:val="es-CL"/>
+        </w:rPr>
+      </w:pPr>
+      <w:r>
+        <w:rPr>
+          <w:rFonts w:ascii="Arial" w:hAnsi="Arial"/>
+          <w:sz w:val="21"/>
+          <w:lang w:val="es-CL"/>
+        </w:rPr>
+        <w:t xml:space="preserve">El equipo aplicará Scrum con cinco </w:t>
+      </w:r>
+      <w:proofErr w:type="spellStart"/>
+      <w:r>
+        <w:rPr>
+          <w:rFonts w:ascii="Arial" w:hAnsi="Arial"/>
+          <w:sz w:val="21"/>
+          <w:lang w:val="es-CL"/>
+        </w:rPr>
+        <w:t>sprints</w:t>
+      </w:r>
+      <w:proofErr w:type="spellEnd"/>
+      <w:r>
+        <w:rPr>
+          <w:rFonts w:ascii="Arial" w:hAnsi="Arial"/>
+          <w:sz w:val="21"/>
+          <w:lang w:val="es-CL"/>
+        </w:rPr>
+        <w:t xml:space="preserve"> de desarrollo entre las semanas 5 y 15. </w:t>
+      </w:r>
+      <w:r>
+        <w:rPr>
+          <w:rFonts w:ascii="Arial" w:hAnsi="Arial"/>
+          <w:sz w:val="21"/>
+        </w:rPr>
+        <w:t xml:space="preserve">Las </w:t>
+      </w:r>
+      <w:proofErr w:type="spellStart"/>
+      <w:r>
+        <w:rPr>
+          <w:rFonts w:ascii="Arial" w:hAnsi="Arial"/>
+          <w:sz w:val="21"/>
+        </w:rPr>
+        <w:t>semanas</w:t>
+      </w:r>
+      <w:proofErr w:type="spellEnd"/>
+      <w:r>
+        <w:rPr>
+          <w:rFonts w:ascii="Arial" w:hAnsi="Arial"/>
+          <w:sz w:val="21"/>
+        </w:rPr>
+        <w:t xml:space="preserve"> 1 a 4 </w:t>
+      </w:r>
+      <w:proofErr w:type="spellStart"/>
+      <w:r>
+        <w:rPr>
+          <w:rFonts w:ascii="Arial" w:hAnsi="Arial"/>
+          <w:sz w:val="21"/>
+        </w:rPr>
+        <w:t>cubrirán</w:t>
+      </w:r>
+      <w:proofErr w:type="spellEnd"/>
+      <w:r>
+        <w:rPr>
+          <w:rFonts w:ascii="Arial" w:hAnsi="Arial"/>
+          <w:sz w:val="21"/>
+        </w:rPr>
+        <w:t xml:space="preserve"> </w:t>
+      </w:r>
+      <w:proofErr w:type="spellStart"/>
+      <w:r>
+        <w:rPr>
+          <w:rFonts w:ascii="Arial" w:hAnsi="Arial"/>
+          <w:sz w:val="21"/>
+        </w:rPr>
+        <w:t>alcance</w:t>
+      </w:r>
+      <w:proofErr w:type="spellEnd"/>
+      <w:r>
+        <w:rPr>
+          <w:rFonts w:ascii="Arial" w:hAnsi="Arial"/>
+          <w:sz w:val="21"/>
+        </w:rPr>
+        <w:t xml:space="preserve">, </w:t>
+      </w:r>
+      <w:proofErr w:type="spellStart"/>
+      <w:r>
+        <w:rPr>
+          <w:rFonts w:ascii="Arial" w:hAnsi="Arial"/>
+          <w:sz w:val="21"/>
+        </w:rPr>
+        <w:t>requisitos</w:t>
+      </w:r>
+      <w:proofErr w:type="spellEnd"/>
+      <w:r>
+        <w:rPr>
+          <w:rFonts w:ascii="Arial" w:hAnsi="Arial"/>
+          <w:sz w:val="21"/>
+        </w:rPr>
+        <w:t xml:space="preserve">, </w:t>
+      </w:r>
+      <w:proofErr w:type="spellStart"/>
+      <w:r>
+        <w:rPr>
+          <w:rFonts w:ascii="Arial" w:hAnsi="Arial"/>
+          <w:sz w:val="21"/>
+        </w:rPr>
+        <w:t>arquitectura</w:t>
+      </w:r>
+      <w:proofErr w:type="spellEnd"/>
+      <w:r>
+        <w:rPr>
+          <w:rFonts w:ascii="Arial" w:hAnsi="Arial"/>
+          <w:sz w:val="21"/>
+        </w:rPr>
+        <w:t xml:space="preserve"> y </w:t>
+      </w:r>
+      <w:proofErr w:type="spellStart"/>
+      <w:r>
+        <w:rPr>
+          <w:rFonts w:ascii="Arial" w:hAnsi="Arial"/>
+          <w:sz w:val="21"/>
+        </w:rPr>
+        <w:t>preparación</w:t>
+      </w:r>
+      <w:proofErr w:type="spellEnd"/>
+      <w:r>
+        <w:rPr>
+          <w:rFonts w:ascii="Arial" w:hAnsi="Arial"/>
+          <w:sz w:val="21"/>
+        </w:rPr>
+        <w:t xml:space="preserve">. </w:t>
+      </w:r>
+      <w:r>
+        <w:rPr>
+          <w:rFonts w:ascii="Arial" w:hAnsi="Arial"/>
+          <w:sz w:val="21"/>
+          <w:lang w:val="es-CL"/>
+        </w:rPr>
+        <w:t>Las semanas 16 a 18 cubrirán estabilización, despliegue, demostración y defensa. Cada sprint incluirá planificación, seguimiento, refinamiento, revisión, retrospectiva, pruebas y actualización documental. La Carta Gantt mostrará duración y dependencias, mientras el backlog permitirá inspeccionar y adaptar el trabajo (Schwaber &amp; Sutherland, 2020).</w:t>
       </w:r>
     </w:p>
     <w:p>
@@ -1446,38 +1930,29 @@
         <w:pStyle w:val="Ttulo1"/>
       </w:pPr>
       <w:r>
-        <w:t>6. Factibilidad</w:t>
-      </w:r>
-    </w:p>
-    <w:p>
-      <w:r>
-        <w:t xml:space="preserve">La factibilidad técnica se sustenta en una base React 18/Vite y Node/Express, documentación API y Firestore, y una compilación exitosa del frontend realizada sobre una copia temporal. La factibilidad temporal se apoya en un calendario de 18 semanas: Sprint 0 para definición, cinco sprints principales de aproximadamente dos semanas con trabajo paralelo y períodos posteriores de release, transición y cierre. La factibilidad operativa </w:t>
-      </w:r>
-      <w:r>
-        <w:lastRenderedPageBreak/>
-        <w:t>depende de validar evidencias con el docente, disponer luego de un repositorio público saneado y reemplazar mecanismos demostrativos por controles productivos.</w:t>
-      </w:r>
-    </w:p>
-    <w:p>
-      <w:pPr>
-        <w:pStyle w:val="Ttulo1"/>
-      </w:pPr>
-      <w:r>
-        <w:t>7. Metodología</w:t>
-      </w:r>
-    </w:p>
-    <w:p>
-      <w:r>
-        <w:t>Se aplicará Scrum adaptado al calendario CAPSTONE. El Product Owner prioriza valor; el Scrum Master facilita el proceso; el equipo mantiene Product Backlog, Sprint Backlog, Definition of Ready y Definition of Done. La Carta Gantt se utiliza como representación académica de dependencias, sin reemplazar la inspección y adaptación de Scrum (Schwaber &amp; Sutherland, 2020).</w:t>
-      </w:r>
-    </w:p>
-    <w:p>
-      <w:pPr>
-        <w:pStyle w:val="Ttulo1"/>
-      </w:pPr>
-      <w:r>
-        <w:t>8. Arquitectura y evidencia técnica</w:t>
-      </w:r>
+        <w:t xml:space="preserve">8. </w:t>
+      </w:r>
+      <w:proofErr w:type="spellStart"/>
+      <w:r>
+        <w:t>Arquitectura</w:t>
+      </w:r>
+      <w:proofErr w:type="spellEnd"/>
+      <w:r>
+        <w:t xml:space="preserve"> y </w:t>
+      </w:r>
+      <w:proofErr w:type="spellStart"/>
+      <w:r>
+        <w:t>evidencia</w:t>
+      </w:r>
+      <w:proofErr w:type="spellEnd"/>
+      <w:r>
+        <w:t xml:space="preserve"> </w:t>
+      </w:r>
+      <w:proofErr w:type="spellStart"/>
+      <w:r>
+        <w:t>técnica</w:t>
+      </w:r>
+      <w:proofErr w:type="spellEnd"/>
     </w:p>
     <w:p>
       <w:pPr>
@@ -1493,9 +1968,17 @@
           <w:between w:val="nil"/>
         </w:pBdr>
         <w:spacing w:after="0"/>
-      </w:pPr>
-      <w:r>
-        <w:t>Frontend: React 18, React Router y Vite; ocho vistas y control visual por rol.</w:t>
+        <w:rPr>
+          <w:lang w:val="es-CL"/>
+        </w:rPr>
+      </w:pPr>
+      <w:r>
+        <w:rPr>
+          <w:rFonts w:ascii="Arial" w:hAnsi="Arial"/>
+          <w:sz w:val="21"/>
+          <w:lang w:val="es-CL"/>
+        </w:rPr>
+        <w:t>Interfaz de servicio: API REST versionada con 27 rutas administrativas y respuestas normalizadas mediante data, error y meta.</w:t>
       </w:r>
     </w:p>
     <w:p>
@@ -1512,9 +1995,17 @@
           <w:between w:val="nil"/>
         </w:pBdr>
         <w:spacing w:after="0"/>
-      </w:pPr>
-      <w:r>
-        <w:t>Backend: Express, rutas administrativas, envelope común y middleware JWT/RBAC.</w:t>
+        <w:rPr>
+          <w:lang w:val="es-CL"/>
+        </w:rPr>
+      </w:pPr>
+      <w:r>
+        <w:rPr>
+          <w:rFonts w:ascii="Arial" w:hAnsi="Arial"/>
+          <w:sz w:val="21"/>
+          <w:lang w:val="es-CL"/>
+        </w:rPr>
+        <w:t>Aplicación: autenticación, autorización por roles, validación, servicios de negocio y registro de acciones administrativas.</w:t>
       </w:r>
     </w:p>
     <w:p>
@@ -1531,9 +2022,17 @@
           <w:between w:val="nil"/>
         </w:pBdr>
         <w:spacing w:after="0"/>
-      </w:pPr>
-      <w:r>
-        <w:t>Datos: Firebase Admin SDK y Firestore; reglas bloquean acceso directo de clientes.</w:t>
+        <w:rPr>
+          <w:lang w:val="es-CL"/>
+        </w:rPr>
+      </w:pPr>
+      <w:r>
+        <w:rPr>
+          <w:rFonts w:ascii="Arial" w:hAnsi="Arial"/>
+          <w:sz w:val="21"/>
+          <w:lang w:val="es-CL"/>
+        </w:rPr>
+        <w:t>Persistencia: capa desacoplada del motor de base de datos. La conexión física quedará pendiente hasta recibir la base y sus credenciales.</w:t>
       </w:r>
     </w:p>
     <w:p>
@@ -1552,7 +2051,115 @@
         <w:spacing w:after="0"/>
       </w:pPr>
       <w:r>
-        <w:t>Estado verificado: compilación frontend y sintaxis backend; integración Firestore y funciones de negocio no fueron ejecutadas.</w:t>
+        <w:rPr>
+          <w:rFonts w:ascii="Arial" w:hAnsi="Arial"/>
+          <w:sz w:val="21"/>
+          <w:lang w:val="es-CL"/>
+        </w:rPr>
+        <w:t xml:space="preserve">Estado verificable de Fase 1: contrato funcional, alcance, requisitos, planificación, arquitectura propuesta y estrategia de pruebas. </w:t>
+      </w:r>
+      <w:r>
+        <w:rPr>
+          <w:rFonts w:ascii="Arial" w:hAnsi="Arial"/>
+          <w:sz w:val="21"/>
+        </w:rPr>
+        <w:t xml:space="preserve">El </w:t>
+      </w:r>
+      <w:proofErr w:type="spellStart"/>
+      <w:r>
+        <w:rPr>
+          <w:rFonts w:ascii="Arial" w:hAnsi="Arial"/>
+          <w:sz w:val="21"/>
+        </w:rPr>
+        <w:t>código</w:t>
+      </w:r>
+      <w:proofErr w:type="spellEnd"/>
+      <w:r>
+        <w:rPr>
+          <w:rFonts w:ascii="Arial" w:hAnsi="Arial"/>
+          <w:sz w:val="21"/>
+        </w:rPr>
+        <w:t xml:space="preserve"> </w:t>
+      </w:r>
+      <w:proofErr w:type="spellStart"/>
+      <w:r>
+        <w:rPr>
+          <w:rFonts w:ascii="Arial" w:hAnsi="Arial"/>
+          <w:sz w:val="21"/>
+        </w:rPr>
+        <w:t>vigente</w:t>
+      </w:r>
+      <w:proofErr w:type="spellEnd"/>
+      <w:r>
+        <w:rPr>
+          <w:rFonts w:ascii="Arial" w:hAnsi="Arial"/>
+          <w:sz w:val="21"/>
+        </w:rPr>
+        <w:t xml:space="preserve"> </w:t>
+      </w:r>
+      <w:proofErr w:type="spellStart"/>
+      <w:r>
+        <w:rPr>
+          <w:rFonts w:ascii="Arial" w:hAnsi="Arial"/>
+          <w:sz w:val="21"/>
+        </w:rPr>
+        <w:t>todavía</w:t>
+      </w:r>
+      <w:proofErr w:type="spellEnd"/>
+      <w:r>
+        <w:rPr>
+          <w:rFonts w:ascii="Arial" w:hAnsi="Arial"/>
+          <w:sz w:val="21"/>
+        </w:rPr>
+        <w:t xml:space="preserve"> no </w:t>
+      </w:r>
+      <w:proofErr w:type="spellStart"/>
+      <w:r>
+        <w:rPr>
+          <w:rFonts w:ascii="Arial" w:hAnsi="Arial"/>
+          <w:sz w:val="21"/>
+        </w:rPr>
+        <w:t>fue</w:t>
+      </w:r>
+      <w:proofErr w:type="spellEnd"/>
+      <w:r>
+        <w:rPr>
+          <w:rFonts w:ascii="Arial" w:hAnsi="Arial"/>
+          <w:sz w:val="21"/>
+        </w:rPr>
+        <w:t xml:space="preserve"> </w:t>
+      </w:r>
+      <w:proofErr w:type="spellStart"/>
+      <w:r>
+        <w:rPr>
+          <w:rFonts w:ascii="Arial" w:hAnsi="Arial"/>
+          <w:sz w:val="21"/>
+        </w:rPr>
+        <w:t>entregado</w:t>
+      </w:r>
+      <w:proofErr w:type="spellEnd"/>
+      <w:r>
+        <w:rPr>
+          <w:rFonts w:ascii="Arial" w:hAnsi="Arial"/>
+          <w:sz w:val="21"/>
+        </w:rPr>
+        <w:t xml:space="preserve"> para </w:t>
+      </w:r>
+      <w:proofErr w:type="spellStart"/>
+      <w:r>
+        <w:rPr>
+          <w:rFonts w:ascii="Arial" w:hAnsi="Arial"/>
+          <w:sz w:val="21"/>
+        </w:rPr>
+        <w:t>evaluación</w:t>
+      </w:r>
+      <w:proofErr w:type="spellEnd"/>
+      <w:r>
+        <w:rPr>
+          <w:rFonts w:ascii="Arial" w:hAnsi="Arial"/>
+          <w:sz w:val="21"/>
+        </w:rPr>
+        <w:t>.</w:t>
       </w:r>
     </w:p>
     <w:p>
@@ -1568,9 +2175,17 @@
           <w:right w:val="nil"/>
           <w:between w:val="nil"/>
         </w:pBdr>
-      </w:pPr>
-      <w:r>
-        <w:t>Brechas: MFA demostrativo con OTP fijo, ausencia de pruebas automatizadas, Docker, CI/CD, lockfiles y observabilidad productiva.</w:t>
+        <w:rPr>
+          <w:lang w:val="es-CL"/>
+        </w:rPr>
+      </w:pPr>
+      <w:r>
+        <w:rPr>
+          <w:rFonts w:ascii="Arial" w:hAnsi="Arial"/>
+          <w:sz w:val="21"/>
+          <w:lang w:val="es-CL"/>
+        </w:rPr>
+        <w:t>Pendientes técnicos: repositorio vigente, tecnología de persistencia, datos de prueba, servicios externos, herramientas de automatización, ambientes y proveedor de despliegue.</w:t>
       </w:r>
     </w:p>
     <w:p>
@@ -1578,8 +2193,21 @@
         <w:pStyle w:val="Ttulo1"/>
       </w:pPr>
       <w:r>
-        <w:t>9. Evidencias propuestas</w:t>
-      </w:r>
+        <w:t xml:space="preserve">9. </w:t>
+      </w:r>
+      <w:proofErr w:type="spellStart"/>
+      <w:r>
+        <w:t>Evidencias</w:t>
+      </w:r>
+      <w:proofErr w:type="spellEnd"/>
+      <w:r>
+        <w:t xml:space="preserve"> </w:t>
+      </w:r>
+      <w:proofErr w:type="spellStart"/>
+      <w:r>
+        <w:t>propuestas</w:t>
+      </w:r>
+      <w:proofErr w:type="spellEnd"/>
     </w:p>
     <w:tbl>
       <w:tblPr>
@@ -1613,6 +2241,7 @@
             <w:pPr>
               <w:spacing w:after="20" w:line="240" w:lineRule="auto"/>
             </w:pPr>
+            <w:proofErr w:type="spellStart"/>
             <w:r>
               <w:rPr>
                 <w:b/>
@@ -1623,6 +2252,7 @@
               </w:rPr>
               <w:t>Momento</w:t>
             </w:r>
+            <w:proofErr w:type="spellEnd"/>
           </w:p>
         </w:tc>
         <w:tc>
@@ -1639,6 +2269,7 @@
             <w:pPr>
               <w:spacing w:after="20" w:line="240" w:lineRule="auto"/>
             </w:pPr>
+            <w:proofErr w:type="spellStart"/>
             <w:r>
               <w:rPr>
                 <w:b/>
@@ -1649,6 +2280,7 @@
               </w:rPr>
               <w:t>Evidencia</w:t>
             </w:r>
+            <w:proofErr w:type="spellEnd"/>
           </w:p>
         </w:tc>
         <w:tc>
@@ -1692,13 +2324,10 @@
             <w:vAlign w:val="center"/>
           </w:tcPr>
           <w:p>
-            <w:pPr>
-              <w:spacing w:after="20" w:line="240" w:lineRule="auto"/>
-            </w:pPr>
             <w:r>
               <w:rPr>
-                <w:sz w:val="17"/>
-                <w:szCs w:val="17"/>
+                <w:rFonts w:ascii="Arial" w:hAnsi="Arial"/>
+                <w:sz w:val="18"/>
               </w:rPr>
               <w:t>Avance</w:t>
             </w:r>
@@ -1715,15 +2344,28 @@
           </w:tcPr>
           <w:p>
             <w:pPr>
-              <w:spacing w:after="20" w:line="240" w:lineRule="auto"/>
+              <w:rPr>
+                <w:lang w:val="es-CL"/>
+              </w:rPr>
             </w:pPr>
             <w:r>
               <w:rPr>
-                <w:sz w:val="17"/>
-                <w:szCs w:val="17"/>
+                <w:rFonts w:ascii="Arial" w:hAnsi="Arial"/>
+                <w:sz w:val="18"/>
+                <w:lang w:val="es-CL"/>
               </w:rPr>
-              <w:t>Backlog, arquitectura, requisitos y compilación</w:t>
+              <w:t xml:space="preserve">Contrato, requisitos, backlog y arquitectura del </w:t>
             </w:r>
+            <w:proofErr w:type="spellStart"/>
+            <w:r>
+              <w:rPr>
+                <w:rFonts w:ascii="Arial" w:hAnsi="Arial"/>
+                <w:sz w:val="18"/>
+                <w:lang w:val="es-CL"/>
+              </w:rPr>
+              <w:t>backend</w:t>
+            </w:r>
+            <w:proofErr w:type="spellEnd"/>
           </w:p>
         </w:tc>
         <w:tc>
@@ -1737,14 +2379,17 @@
           </w:tcPr>
           <w:p>
             <w:pPr>
-              <w:spacing w:after="20" w:line="240" w:lineRule="auto"/>
+              <w:rPr>
+                <w:lang w:val="es-CL"/>
+              </w:rPr>
             </w:pPr>
             <w:r>
               <w:rPr>
-                <w:sz w:val="17"/>
-                <w:szCs w:val="17"/>
+                <w:rFonts w:ascii="Arial" w:hAnsi="Arial"/>
+                <w:sz w:val="18"/>
+                <w:lang w:val="es-CL"/>
               </w:rPr>
-              <w:t>Propuesta pendiente de validación docente</w:t>
+              <w:t>Planificado. Pendiente de validación docente.</w:t>
             </w:r>
           </w:p>
         </w:tc>
@@ -1763,13 +2408,10 @@
             <w:vAlign w:val="center"/>
           </w:tcPr>
           <w:p>
-            <w:pPr>
-              <w:spacing w:after="20" w:line="240" w:lineRule="auto"/>
-            </w:pPr>
             <w:r>
               <w:rPr>
-                <w:sz w:val="17"/>
-                <w:szCs w:val="17"/>
+                <w:rFonts w:ascii="Arial" w:hAnsi="Arial"/>
+                <w:sz w:val="18"/>
               </w:rPr>
               <w:t>Avance</w:t>
             </w:r>
@@ -1786,15 +2428,28 @@
           </w:tcPr>
           <w:p>
             <w:pPr>
-              <w:spacing w:after="20" w:line="240" w:lineRule="auto"/>
+              <w:rPr>
+                <w:lang w:val="es-CL"/>
+              </w:rPr>
             </w:pPr>
             <w:r>
               <w:rPr>
-                <w:sz w:val="17"/>
-                <w:szCs w:val="17"/>
+                <w:rFonts w:ascii="Arial" w:hAnsi="Arial"/>
+                <w:sz w:val="18"/>
+                <w:lang w:val="es-CL"/>
               </w:rPr>
-              <w:t>Plan y ejecución inicial de pruebas</w:t>
+              <w:t xml:space="preserve">Estrategia y casos de prueba vinculados a los 27 </w:t>
             </w:r>
+            <w:proofErr w:type="spellStart"/>
+            <w:r>
+              <w:rPr>
+                <w:rFonts w:ascii="Arial" w:hAnsi="Arial"/>
+                <w:sz w:val="18"/>
+                <w:lang w:val="es-CL"/>
+              </w:rPr>
+              <w:t>endpoints</w:t>
+            </w:r>
+            <w:proofErr w:type="spellEnd"/>
           </w:p>
         </w:tc>
         <w:tc>
@@ -1808,14 +2463,17 @@
           </w:tcPr>
           <w:p>
             <w:pPr>
-              <w:spacing w:after="20" w:line="240" w:lineRule="auto"/>
+              <w:rPr>
+                <w:lang w:val="es-CL"/>
+              </w:rPr>
             </w:pPr>
             <w:r>
               <w:rPr>
-                <w:sz w:val="17"/>
-                <w:szCs w:val="17"/>
+                <w:rFonts w:ascii="Arial" w:hAnsi="Arial"/>
+                <w:sz w:val="18"/>
+                <w:lang w:val="es-CL"/>
               </w:rPr>
-              <w:t>Planificado</w:t>
+              <w:t>Planificado. La ejecución depende del código y los ambientes vigentes.</w:t>
             </w:r>
           </w:p>
         </w:tc>
@@ -1834,13 +2492,10 @@
             <w:vAlign w:val="center"/>
           </w:tcPr>
           <w:p>
-            <w:pPr>
-              <w:spacing w:after="20" w:line="240" w:lineRule="auto"/>
-            </w:pPr>
             <w:r>
               <w:rPr>
-                <w:sz w:val="17"/>
-                <w:szCs w:val="17"/>
+                <w:rFonts w:ascii="Arial" w:hAnsi="Arial"/>
+                <w:sz w:val="18"/>
               </w:rPr>
               <w:t>Final</w:t>
             </w:r>
@@ -1857,14 +2512,17 @@
           </w:tcPr>
           <w:p>
             <w:pPr>
-              <w:spacing w:after="20" w:line="240" w:lineRule="auto"/>
+              <w:rPr>
+                <w:lang w:val="es-CL"/>
+              </w:rPr>
             </w:pPr>
             <w:r>
               <w:rPr>
-                <w:sz w:val="17"/>
-                <w:szCs w:val="17"/>
+                <w:rFonts w:ascii="Arial" w:hAnsi="Arial"/>
+                <w:sz w:val="18"/>
+                <w:lang w:val="es-CL"/>
               </w:rPr>
-              <w:t>Repositorio público saneado, producto, manuales y trazabilidad</w:t>
+              <w:t>API, repositorio vigente, pruebas automatizadas y manual técnico</w:t>
             </w:r>
           </w:p>
         </w:tc>
@@ -1879,14 +2537,17 @@
           </w:tcPr>
           <w:p>
             <w:pPr>
-              <w:spacing w:after="20" w:line="240" w:lineRule="auto"/>
+              <w:rPr>
+                <w:lang w:val="es-CL"/>
+              </w:rPr>
             </w:pPr>
             <w:r>
               <w:rPr>
-                <w:sz w:val="17"/>
-                <w:szCs w:val="17"/>
+                <w:rFonts w:ascii="Arial" w:hAnsi="Arial"/>
+                <w:sz w:val="18"/>
+                <w:lang w:val="es-CL"/>
               </w:rPr>
-              <w:t>URL pendiente</w:t>
+              <w:t>Pendiente de repositorio, base de datos y credenciales.</w:t>
             </w:r>
           </w:p>
         </w:tc>
@@ -1905,13 +2566,10 @@
             <w:vAlign w:val="center"/>
           </w:tcPr>
           <w:p>
-            <w:pPr>
-              <w:spacing w:after="20" w:line="240" w:lineRule="auto"/>
-            </w:pPr>
             <w:r>
               <w:rPr>
-                <w:sz w:val="17"/>
-                <w:szCs w:val="17"/>
+                <w:rFonts w:ascii="Arial" w:hAnsi="Arial"/>
+                <w:sz w:val="18"/>
               </w:rPr>
               <w:t>Defensa</w:t>
             </w:r>
@@ -1928,14 +2586,17 @@
           </w:tcPr>
           <w:p>
             <w:pPr>
-              <w:spacing w:after="20" w:line="240" w:lineRule="auto"/>
+              <w:rPr>
+                <w:lang w:val="es-CL"/>
+              </w:rPr>
             </w:pPr>
             <w:r>
               <w:rPr>
-                <w:sz w:val="17"/>
-                <w:szCs w:val="17"/>
+                <w:rFonts w:ascii="Arial" w:hAnsi="Arial"/>
+                <w:sz w:val="18"/>
+                <w:lang w:val="es-CL"/>
               </w:rPr>
-              <w:t>Presentación, demostración y distribución de aportes</w:t>
+              <w:t>Demostración de solicitudes, resultados de pruebas y trazabilidad de aportes</w:t>
             </w:r>
           </w:p>
         </w:tc>
@@ -1950,66 +2611,132 @@
           </w:tcPr>
           <w:p>
             <w:pPr>
-              <w:spacing w:after="20" w:line="240" w:lineRule="auto"/>
+              <w:rPr>
+                <w:lang w:val="es-CL"/>
+              </w:rPr>
             </w:pPr>
             <w:r>
               <w:rPr>
-                <w:sz w:val="17"/>
-                <w:szCs w:val="17"/>
+                <w:rFonts w:ascii="Arial" w:hAnsi="Arial"/>
+                <w:sz w:val="18"/>
+                <w:lang w:val="es-CL"/>
               </w:rPr>
-              <w:t>Planificado</w:t>
+              <w:t>Planificado para evaluación del docente.</w:t>
             </w:r>
           </w:p>
         </w:tc>
       </w:tr>
     </w:tbl>
-    <w:p/>
     <w:p>
       <w:pPr>
-        <w:pStyle w:val="Ttulo1"/>
-      </w:pPr>
-      <w:r>
-        <w:t>10. Propiedad intelectual y uso de IA</w:t>
-      </w:r>
+        <w:rPr>
+          <w:lang w:val="es-CL"/>
+        </w:rPr>
+      </w:pPr>
     </w:p>
     <w:p>
-      <w:r>
-        <w:t>La autoría del trabajo corresponde al equipo y las contribuciones se registran por rol y evidencia. El uso de inteligencia artificial se declara como apoyo para estructuración, revisión y generación asistida de borradores, con validación humana de afirmaciones, código, citas y decisiones. No se atribuyen a la IA resultados técnicos no ejecutados ni se reemplaza la responsabilidad académica del equipo.</w:t>
+      <w:pPr>
+        <w:pStyle w:val="Ttulo1"/>
+        <w:rPr>
+          <w:lang w:val="es-CL"/>
+        </w:rPr>
+      </w:pPr>
+      <w:r>
+        <w:rPr>
+          <w:lang w:val="es-CL"/>
+        </w:rPr>
+        <w:t>11. Conclusión grupal</w:t>
       </w:r>
     </w:p>
     <w:p>
       <w:pPr>
-        <w:pStyle w:val="Ttulo1"/>
-      </w:pPr>
-      <w:r>
-        <w:lastRenderedPageBreak/>
-        <w:t>11. Conclusión grupal</w:t>
+        <w:rPr>
+          <w:lang w:val="es-CL"/>
+        </w:rPr>
+      </w:pPr>
+      <w:r>
+        <w:rPr>
+          <w:rFonts w:ascii="Arial" w:hAnsi="Arial"/>
+          <w:sz w:val="21"/>
+          <w:lang w:val="es-CL"/>
+        </w:rPr>
+        <w:t xml:space="preserve">La Fase 1 deja una definición coherente para desarrollar el </w:t>
+      </w:r>
+      <w:proofErr w:type="spellStart"/>
+      <w:r>
+        <w:rPr>
+          <w:rFonts w:ascii="Arial" w:hAnsi="Arial"/>
+          <w:sz w:val="21"/>
+          <w:lang w:val="es-CL"/>
+        </w:rPr>
+        <w:t>backend</w:t>
+      </w:r>
+      <w:proofErr w:type="spellEnd"/>
+      <w:r>
+        <w:rPr>
+          <w:rFonts w:ascii="Arial" w:hAnsi="Arial"/>
+          <w:sz w:val="21"/>
+          <w:lang w:val="es-CL"/>
+        </w:rPr>
+        <w:t xml:space="preserve"> administrativo sin depender de supuestos sobre el código o la infraestructura. Los 27 </w:t>
+      </w:r>
+      <w:proofErr w:type="spellStart"/>
+      <w:r>
+        <w:rPr>
+          <w:rFonts w:ascii="Arial" w:hAnsi="Arial"/>
+          <w:sz w:val="21"/>
+          <w:lang w:val="es-CL"/>
+        </w:rPr>
+        <w:t>endpoints</w:t>
+      </w:r>
+      <w:proofErr w:type="spellEnd"/>
+      <w:r>
+        <w:rPr>
+          <w:rFonts w:ascii="Arial" w:hAnsi="Arial"/>
+          <w:sz w:val="21"/>
+          <w:lang w:val="es-CL"/>
+        </w:rPr>
+        <w:t>, sus roles y sus reglas constituyen la base del backlog, la arquitectura, las pruebas y el cronograma. La implementación y sus resultados se demostrarán después de recibir los insumos vigentes y ejecutar las verificaciones previstas.</w:t>
       </w:r>
     </w:p>
     <w:p>
-      <w:r>
-        <w:t>La definición establece un alcance viable y trazable para convertir una base técnica existente en un producto administrable, seguro y evaluable. La prioridad siguiente es cerrar las brechas de pruebas, autenticación productiva, automatización y despliegue, manteniendo evidencia individual visible. Las conclusiones individuales en inglés permanecen pendientes de autorización.</w:t>
-      </w:r>
-    </w:p>
-    <w:p/>
-    <w:p>
-      <w:pPr>
-        <w:pStyle w:val="Ttulo1"/>
-      </w:pPr>
-      <w:r>
-        <w:t>12. Conclusiones individuales</w:t>
-      </w:r>
+      <w:pPr>
+        <w:rPr>
+          <w:lang w:val="es-CL"/>
+        </w:rPr>
+      </w:pPr>
     </w:p>
     <w:p>
       <w:pPr>
-        <w:pStyle w:val="Ttulo2"/>
-      </w:pPr>
-      <w:r>
-        <w:t>Tsung-Hao Liu</w:t>
-      </w:r>
+        <w:pStyle w:val="Ttulo1"/>
+      </w:pPr>
+      <w:r>
+        <w:t xml:space="preserve">12. </w:t>
+      </w:r>
+      <w:proofErr w:type="spellStart"/>
+      <w:r>
+        <w:t>Conclusiones</w:t>
+      </w:r>
+      <w:proofErr w:type="spellEnd"/>
+      <w:r>
+        <w:t xml:space="preserve"> </w:t>
+      </w:r>
+      <w:proofErr w:type="spellStart"/>
+      <w:r>
+        <w:t>individuales</w:t>
+      </w:r>
+      <w:proofErr w:type="spellEnd"/>
     </w:p>
     <w:p>
       <w:pPr>
+        <w:pStyle w:val="Ttulo2"/>
+      </w:pPr>
+      <w:r>
+        <w:t>Tsung-Hao Liu</w:t>
+      </w:r>
+    </w:p>
+    <w:p>
+      <w:pPr>
         <w:spacing w:before="240" w:after="240"/>
         <w:rPr>
           <w:i/>
@@ -2018,10 +2745,26 @@
       </w:pPr>
       <w:r>
         <w:rPr>
+          <w:rFonts w:ascii="Arial" w:hAnsi="Arial"/>
+          <w:sz w:val="21"/>
+        </w:rPr>
+        <w:t>During Phase 1, my contribution focused on understanding the administrative backend scope and organizing the initial project plan. I reviewed the functional specification and helped connect the twenty-seven administrative endpoints with requirements, activities, responsibilities, risks, and expected evidence. I also contributed to the eighteen-week schedule and to the definition of quality, monitoring, and project-control activities that will continue throughout development. This work relates directly to my interests in web development, backend services, databases, and project organization.</w:t>
+      </w:r>
+    </w:p>
+    <w:p>
+      <w:pPr>
+        <w:spacing w:before="240" w:after="240"/>
+        <w:rPr>
           <w:i/>
           <w:iCs/>
         </w:rPr>
-        <w:t>During Phase 1, my contribution focused on understanding the Aprueba Administración project and participating in its initial planning. I reviewed the available project information and helped define the scope, objectives, main activities, roles, responsibilities, risks, and expected deliverables. I also contributed to organizing the project schedule through the Gantt chart and to identifying the quality, monitoring, and control activities that should be maintained during development.</w:t>
+      </w:pPr>
+      <w:r>
+        <w:rPr>
+          <w:rFonts w:ascii="Arial" w:hAnsi="Arial"/>
+          <w:sz w:val="21"/>
+        </w:rPr>
+        <w:t>My main lesson was that a software team must separate confirmed requirements from assumptions before implementation begins. The database, current repository, external services, and deployment provider are still pending, so the team needs an architecture that can adapt without presenting unverified technologies as final decisions. I also learned how Scrum, a Gantt chart, risk management, documentation, and quality assurance can work together without turning the project plan into a list of academic deadlines.</w:t>
       </w:r>
     </w:p>
     <w:p>
@@ -2034,10 +2777,34 @@
       </w:pPr>
       <w:r>
         <w:rPr>
+          <w:rFonts w:ascii="Arial" w:hAnsi="Arial"/>
+          <w:sz w:val="21"/>
+        </w:rPr>
+        <w:t>In the next phases, I expect to contribute to backend implementation, authentication and authorization, automated tests, integration, and deployment preparation. I will continue improving my technical communication, effort estimation, and coordination skills while ensuring that every reported result has current evidence.</w:t>
+      </w:r>
+    </w:p>
+    <w:p>
+      <w:pPr>
+        <w:pStyle w:val="Ttulo2"/>
+      </w:pPr>
+      <w:r>
+        <w:t>Catalina Yanara Padilla Astudillo</w:t>
+      </w:r>
+    </w:p>
+    <w:p>
+      <w:pPr>
+        <w:spacing w:before="240" w:after="240"/>
+        <w:rPr>
           <w:i/>
           <w:iCs/>
         </w:rPr>
-        <w:t>One of my main lessons was understanding that a software project requires careful preparation before implementation begins. Clear requirements, realistic planning, defined responsibilities, risk management, and continuous communication are essential for coordinating the team and avoiding problems in later phases. I also learned how Scrum can be combined with project monitoring, documentation, and quality assurance without losing its agile approach.</w:t>
+      </w:pPr>
+      <w:r>
+        <w:rPr>
+          <w:rFonts w:ascii="Arial" w:hAnsi="Arial"/>
+          <w:sz w:val="21"/>
+        </w:rPr>
+        <w:t>During Phase 1, my contribution focused on organizing the functional requirements and the information needed by the administrative backend. I helped relate business needs to acceptance criteria for metrics, sponsors, questions, features, and plans. I also contributed to the logical view of the data without assuming a specific database technology, because the current database and credentials will be provided later. This approach connects the project with my interests in data management and machine learning while keeping predictive features outside the agreed scope.</w:t>
       </w:r>
     </w:p>
     <w:p>
@@ -2050,10 +2817,27 @@
       </w:pPr>
       <w:r>
         <w:rPr>
+          <w:rFonts w:ascii="Arial" w:hAnsi="Arial"/>
+          <w:sz w:val="21"/>
+        </w:rPr>
+        <w:t>The main lesson from this phase was that a useful data design starts with the operations and rules exposed by the API. A physical database model should not be presented as final before the team receives the current technical environment. Defining entities, validations, filters, and traceability at a logical level gives the team a stable foundation and reduces the risk of designing around an obsolete implementation.</w:t>
+      </w:r>
+    </w:p>
+    <w:p>
+      <w:pPr>
+        <w:spacing w:before="240" w:after="240"/>
+        <w:rPr>
           <w:i/>
           <w:iCs/>
         </w:rPr>
-        <w:t>This phase allowed me to strengthen my skills in project planning, teamwork, technical analysis, and decision-making. In the next phases, I expect to apply this planning while contributing to backend development, security, deployment, and system monitoring. I will also continue improving my communication and coordination skills to support the team and achieve the project objectives.</w:t>
+      </w:pPr>
+      <w:r>
+        <w:rPr>
+          <w:rFonts w:ascii="Arial" w:hAnsi="Arial"/>
+          <w:sz w:val="21"/>
+        </w:rPr>
+        <w:lastRenderedPageBreak/>
+        <w:t>In the next phases, I expect to support backlog refinement, acceptance criteria, documentation, and the connection between the administrative operations and the delivered data source. I will also help the team keep the evidence aligned with the actual implementation and test results.</w:t>
       </w:r>
     </w:p>
     <w:p>
@@ -2061,12 +2845,12 @@
         <w:pStyle w:val="Ttulo2"/>
       </w:pPr>
       <w:r>
-        <w:t>Catalina Yanara Padilla Astudillo</w:t>
+        <w:t>Felipe Antonio Rojas Riffo</w:t>
       </w:r>
     </w:p>
     <w:p>
       <w:pPr>
-        <w:spacing w:before="240" w:after="240"/>
+        <w:spacing w:after="240"/>
         <w:rPr>
           <w:i/>
           <w:iCs/>
@@ -2074,10 +2858,26 @@
       </w:pPr>
       <w:r>
         <w:rPr>
+          <w:rFonts w:ascii="Arial" w:hAnsi="Arial"/>
+          <w:sz w:val="21"/>
+        </w:rPr>
+        <w:t>During Phase 1, my contribution focused on planning the architecture, quality controls, and operational readiness of the administrative backend. I helped group the twenty-seven endpoints into manageable increments and identify the controls required for authentication, role authorization, validation, error handling, logging, and automated testing. I also contributed to defining how risks, changes, defects, and evidence should be recorded throughout the project.</w:t>
+      </w:r>
+    </w:p>
+    <w:p>
+      <w:pPr>
+        <w:spacing w:before="240" w:after="240"/>
+        <w:rPr>
           <w:i/>
           <w:iCs/>
         </w:rPr>
-        <w:t>During Phase 1, my contribution focused on the foundational and data-oriented aspects of Aprueba Administración. I helped build the base layout during the Cimientos sprint, and I am responsible for the business modules (Overview, Comercial, and Sponsors) as well as the Contenido y planes module, where I design the question bank and plan builder on Firestore.</w:t>
+      </w:pPr>
+      <w:r>
+        <w:rPr>
+          <w:rFonts w:ascii="Arial" w:hAnsi="Arial"/>
+          <w:sz w:val="21"/>
+        </w:rPr>
+        <w:t>My main lesson was that quality and deployment planning must begin before coding, while still remaining neutral about tools that have not been confirmed. The team can define the required capabilities for continuous testing, secure configuration, release, rollback, and monitoring without claiming that a particular platform or container technology is already available. This distinction makes the plan more accurate and easier to adapt when the current repository and environments arrive.</w:t>
       </w:r>
     </w:p>
     <w:p>
@@ -2090,91 +2890,99 @@
       </w:pPr>
       <w:r>
         <w:rPr>
-          <w:i/>
-          <w:iCs/>
-        </w:rPr>
-        <w:t>My main lesson was realizing how much a well-designed data model affects everything built on top of it: unclear structures in Firestore directly complicate the frontend views and the reliability of the metrics they display. I also learned to balance the MVP scope with my longer-term interest in data and machine learning.</w:t>
+          <w:rFonts w:ascii="Arial" w:hAnsi="Arial"/>
+          <w:sz w:val="21"/>
+        </w:rPr>
+        <w:t>In the next phases, I expect to support architecture decisions, test automation, defect management, release preparation, and operational documentation. I will verify those activities against current evidence and help the team prevent unresolved critical defects from reaching the final demonstration.</w:t>
       </w:r>
     </w:p>
     <w:p>
       <w:pPr>
-        <w:spacing w:before="240" w:after="240"/>
-        <w:rPr>
-          <w:i/>
-          <w:iCs/>
-        </w:rPr>
-      </w:pPr>
-      <w:r>
-        <w:rPr>
-          <w:i/>
-          <w:iCs/>
-        </w:rPr>
-        <w:t>This phase strengthened my skills in data modeling and prioritization under time constraints. In the next phases, I expect to consolidate the business modules and explore how our structured data could eventually support analytics features.</w:t>
+        <w:pStyle w:val="Ttulo1"/>
+        <w:rPr>
+          <w:lang w:val="es-CL"/>
+        </w:rPr>
+      </w:pPr>
+      <w:r>
+        <w:rPr>
+          <w:lang w:val="es-CL"/>
+        </w:rPr>
+        <w:t>Referencias</w:t>
       </w:r>
     </w:p>
     <w:p>
       <w:pPr>
-        <w:pStyle w:val="Ttulo2"/>
-      </w:pPr>
-      <w:r>
-        <w:lastRenderedPageBreak/>
-        <w:t>Felipe Antonio Rojas Riffo</w:t>
+        <w:ind w:left="432" w:hanging="432"/>
+        <w:jc w:val="left"/>
+        <w:rPr>
+          <w:lang w:val="es-CL"/>
+        </w:rPr>
+      </w:pPr>
+      <w:r>
+        <w:rPr>
+          <w:lang w:val="es-CL"/>
+        </w:rPr>
+        <w:t>Duoc UC. (2026). Instructivo CAPSTONE 2026 [Documento institucional].</w:t>
       </w:r>
     </w:p>
     <w:p>
       <w:pPr>
-        <w:spacing w:after="240"/>
-        <w:rPr>
-          <w:i/>
-          <w:iCs/>
-        </w:rPr>
-      </w:pPr>
-      <w:r>
-        <w:rPr>
-          <w:i/>
-          <w:iCs/>
-        </w:rPr>
-        <w:t>During Phase 1, my contribution focused on structuring the architecture, operations, and quality assurance strategies for the Aprueba Administración project. I collaborated in defining the requirements for the operational and support modules, such as user and ticket management, and worked alongside Catalina to plan the foundational structure for the question bank and plan builder. Additionally, I focused on outlining the deployment architecture and testing frameworks, establishing the roadmap for Docker implementation, CI/CD pipelines, and security protocols.</w:t>
+        <w:ind w:left="432" w:hanging="432"/>
+        <w:jc w:val="left"/>
+        <w:rPr>
+          <w:lang w:val="es-CL"/>
+        </w:rPr>
+      </w:pPr>
+      <w:r>
+        <w:rPr>
+          <w:lang w:val="es-CL"/>
+        </w:rPr>
+        <w:t>Duoc UC. (2026). Cronograma CAPSTONE PTY4614, segundo semestre 2026 [Hoja de cálculo institucional].</w:t>
       </w:r>
     </w:p>
     <w:p>
       <w:pPr>
-        <w:spacing w:before="240" w:after="240"/>
-        <w:rPr>
-          <w:i/>
-          <w:iCs/>
-        </w:rPr>
-      </w:pPr>
-      <w:r>
-        <w:rPr>
-          <w:i/>
-          <w:iCs/>
-        </w:rPr>
-        <w:t>One of my main lessons was understanding the critical importance of integrating quality assurance and deployment strategies from the very beginning of a project. I realized that defining clear testing criteria and planning the CI/CD pipelines early on prevents bottlenecks during the implementation phase and ensures smoother transitions between environments. I also learned that designing robust operational support modules requires anticipating how administrators and tutors will interact with the system in a real-world scenario.</w:t>
+        <w:ind w:left="432" w:hanging="432"/>
+        <w:jc w:val="left"/>
+        <w:rPr>
+          <w:lang w:val="es-CL"/>
+        </w:rPr>
+      </w:pPr>
+      <w:r>
+        <w:rPr>
+          <w:lang w:val="es-CL"/>
+        </w:rPr>
+        <w:t>Duoc UC. (2026). Descripción del perfil de egreso: Ingeniería en Informática [Documento institucional].</w:t>
       </w:r>
     </w:p>
     <w:p>
       <w:pPr>
-        <w:spacing w:before="240" w:after="240"/>
-        <w:rPr>
-          <w:i/>
-          <w:iCs/>
-        </w:rPr>
-      </w:pPr>
-      <w:r>
-        <w:rPr>
-          <w:i/>
-          <w:iCs/>
-        </w:rPr>
-        <w:t>This phase allowed me to strengthen my skills in software architecture planning, DevOps methodologies, and collaborative system design. In the next phases, I expect to apply these plans by fully implementing the support and operation modules, configuring the Docker containers and deployment pipelines, and executing comprehensive security and performance tests to ensure a highly scalable, secure, and reliable system.</w:t>
+        <w:ind w:left="432" w:hanging="432"/>
+        <w:jc w:val="left"/>
+        <w:rPr>
+          <w:lang w:val="es-CL"/>
+        </w:rPr>
+      </w:pPr>
+      <w:r>
+        <w:rPr>
+          <w:lang w:val="es-CL"/>
+        </w:rPr>
+        <w:t>Duoc UC. (2026). Evaluación Fase 1 y guía del estudiante: Definición Proyecto APT [Plantillas institucionales].</w:t>
       </w:r>
     </w:p>
     <w:p>
       <w:pPr>
-        <w:pStyle w:val="Ttulo1"/>
-      </w:pPr>
-      <w:r>
-        <w:t>Referencias</w:t>
+        <w:ind w:left="432" w:hanging="432"/>
+        <w:jc w:val="left"/>
+        <w:rPr>
+          <w:lang w:val="es-CL"/>
+        </w:rPr>
+      </w:pPr>
+      <w:r>
+        <w:rPr>
+          <w:lang w:val="es-CL"/>
+        </w:rPr>
+        <w:t>Schwaber, K., &amp; Sutherland, J. (2020). La guía de Scrum. https://scrumguides.org/docs/scrumguide/v2020/2020-Scrum-Guide-Spanish-Latin-South-American.pdf</w:t>
       </w:r>
     </w:p>
     <w:p>
@@ -2183,7 +2991,7 @@
         <w:jc w:val="left"/>
       </w:pPr>
       <w:r>
-        <w:t>Duoc UC. (2026). Instructivo CAPSTONE 2026 [Documento institucional].</w:t>
+        <w:t>National Institute of Standards and Technology. (2022). Secure Software Development Framework (SSDF) version 1.1 (NIST SP 800-218). https://doi.org/10.6028/NIST.SP.800-218</w:t>
       </w:r>
     </w:p>
     <w:p>
@@ -2192,7 +3000,7 @@
         <w:jc w:val="left"/>
       </w:pPr>
       <w:r>
-        <w:t>Duoc UC. (2026). Cronograma CAPSTONE PTY4614, segundo semestre 2026 [Hoja de cálculo institucional].</w:t>
+        <w:t>OWASP Foundation. (2025). Application Security Verification Standard 5.0.0. https://owasp.org/www-project-application-security-verification-standard/</w:t>
       </w:r>
     </w:p>
     <w:p>
@@ -2201,71 +3009,52 @@
         <w:jc w:val="left"/>
       </w:pPr>
       <w:r>
-        <w:t>Duoc UC. (2026). Descripción del perfil de egreso: Ingeniería en Informática [Documento institucional].</w:t>
+        <w:t>World Wide Web Consortium. (2024). Web Content Accessibility Guidelines (WCAG) 2.2. https://www.w3.org/TR/WCAG22/</w:t>
       </w:r>
     </w:p>
     <w:p>
       <w:pPr>
         <w:ind w:left="432" w:hanging="432"/>
         <w:jc w:val="left"/>
-      </w:pPr>
-      <w:r>
-        <w:t>Duoc UC. (2026). Evaluación Fase 1 y guía del estudiante: Definición Proyecto APT [Plantillas institucionales].</w:t>
+        <w:rPr>
+          <w:lang w:val="es-CL"/>
+        </w:rPr>
+      </w:pPr>
+      <w:r>
+        <w:rPr>
+          <w:rFonts w:ascii="Arial" w:hAnsi="Arial"/>
+          <w:sz w:val="21"/>
+          <w:lang w:val="es-CL"/>
+        </w:rPr>
+        <w:t xml:space="preserve">Aprueba. (2026). Especificación de API del </w:t>
+      </w:r>
+      <w:proofErr w:type="spellStart"/>
+      <w:r>
+        <w:rPr>
+          <w:rFonts w:ascii="Arial" w:hAnsi="Arial"/>
+          <w:sz w:val="21"/>
+          <w:lang w:val="es-CL"/>
+        </w:rPr>
+        <w:t>backend</w:t>
+      </w:r>
+      <w:proofErr w:type="spellEnd"/>
+      <w:r>
+        <w:rPr>
+          <w:rFonts w:ascii="Arial" w:hAnsi="Arial"/>
+          <w:sz w:val="21"/>
+          <w:lang w:val="es-CL"/>
+        </w:rPr>
+        <w:t>, versión 1.0 [Documento técnico interno].</w:t>
       </w:r>
     </w:p>
     <w:p>
       <w:pPr>
         <w:ind w:left="432" w:hanging="432"/>
         <w:jc w:val="left"/>
-      </w:pPr>
-      <w:r>
-        <w:t>Schwaber, K., &amp; Sutherland, J. (2020). La guía de Scrum. https://scrumguides.org/docs/scrumguide/v2020/2020-Scrum-Guide-Spanish-Latin-South-American.pdf</w:t>
-      </w:r>
-    </w:p>
-    <w:p>
-      <w:pPr>
-        <w:ind w:left="432" w:hanging="432"/>
-        <w:jc w:val="left"/>
-      </w:pPr>
-      <w:r>
-        <w:t>National Institute of Standards and Technology. (2022). Secure Software Development Framework (SSDF) version 1.1 (NIST SP 800-218). https://doi.org/10.6028/NIST.SP.800-218</w:t>
-      </w:r>
-    </w:p>
-    <w:p>
-      <w:pPr>
-        <w:ind w:left="432" w:hanging="432"/>
-        <w:jc w:val="left"/>
-      </w:pPr>
-      <w:r>
-        <w:t>OWASP Foundation. (2025). Application Security Verification Standard 5.0.0. https://owasp.org/www-project-application-security-verification-standard/</w:t>
-      </w:r>
-    </w:p>
-    <w:p>
-      <w:pPr>
-        <w:ind w:left="432" w:hanging="432"/>
-        <w:jc w:val="left"/>
-      </w:pPr>
-      <w:r>
-        <w:t>World Wide Web Consortium. (2024). Web Content Accessibility Guidelines (WCAG) 2.2. https://www.w3.org/TR/WCAG22/</w:t>
-      </w:r>
-    </w:p>
-    <w:p>
-      <w:pPr>
-        <w:ind w:left="432" w:hanging="432"/>
-        <w:jc w:val="left"/>
-      </w:pPr>
-      <w:r>
-        <w:t>Google. (2026). Add the Firebase Admin SDK to your server. https://firebase.google.com/docs/admin/setup</w:t>
-      </w:r>
-    </w:p>
-    <w:p>
-      <w:pPr>
-        <w:ind w:left="432" w:hanging="432"/>
-        <w:jc w:val="left"/>
-      </w:pPr>
-      <w:r>
-        <w:t>Google. (2026). Get started with Cloud Firestore Security Rules. https://firebase.google.com/docs/firestore/security/get-started</w:t>
-      </w:r>
+        <w:rPr>
+          <w:lang w:val="es-CL"/>
+        </w:rPr>
+      </w:pPr>
     </w:p>
     <w:sectPr>
       <w:headerReference w:type="default" r:id="rId9"/>
@@ -2327,6 +3116,7 @@
         <w:color w:val="5A6778"/>
         <w:sz w:val="16"/>
         <w:szCs w:val="16"/>
+        <w:lang w:val="es-CL"/>
       </w:rPr>
     </w:pPr>
     <w:r>
@@ -2334,6 +3124,7 @@
         <w:color w:val="5A6778"/>
         <w:sz w:val="16"/>
         <w:szCs w:val="16"/>
+        <w:lang w:val="es-CL"/>
       </w:rPr>
       <w:t>Ingeniería en Informática · Sede Plaza Oeste · Documento grupal</w:t>
     </w:r>
@@ -2459,7 +3250,43 @@
         <w:sz w:val="16"/>
         <w:szCs w:val="16"/>
       </w:rPr>
-      <w:t>CAPSTONE 2026  |  Informe académico  |  Aprueba Administración</w:t>
+      <w:t xml:space="preserve">CAPSTONE 2026  |  Informe </w:t>
+    </w:r>
+    <w:proofErr w:type="spellStart"/>
+    <w:r>
+      <w:rPr>
+        <w:color w:val="5A6778"/>
+        <w:sz w:val="16"/>
+        <w:szCs w:val="16"/>
+      </w:rPr>
+      <w:t>académico</w:t>
+    </w:r>
+    <w:proofErr w:type="spellEnd"/>
+    <w:r>
+      <w:rPr>
+        <w:color w:val="5A6778"/>
+        <w:sz w:val="16"/>
+        <w:szCs w:val="16"/>
+      </w:rPr>
+      <w:t xml:space="preserve">  |  </w:t>
+    </w:r>
+    <w:proofErr w:type="spellStart"/>
+    <w:r>
+      <w:rPr>
+        <w:color w:val="5A6778"/>
+        <w:sz w:val="16"/>
+        <w:szCs w:val="16"/>
+      </w:rPr>
+      <w:t>Aprueba</w:t>
+    </w:r>
+    <w:proofErr w:type="spellEnd"/>
+    <w:r>
+      <w:rPr>
+        <w:color w:val="5A6778"/>
+        <w:sz w:val="16"/>
+        <w:szCs w:val="16"/>
+      </w:rPr>
+      <w:t xml:space="preserve"> Administración</w:t>
     </w:r>
   </w:p>
 </w:hdr>

</xml_diff>